<commit_message>
Agrega app Node con chatbot para Render
</commit_message>
<xml_diff>
--- a/entregables/PIAD-627_TRABAJO_FINAL_INNOVVENTAS.docx
+++ b/entregables/PIAD-627_TRABAJO_FINAL_INNOVVENTAS.docx
@@ -300,13 +300,7 @@
               <w:rPr>
                 <w:sz w:val="16"/>
               </w:rPr>
-              <w:t xml:space="preserve">[Completar apellidos y </w:t>
-            </w:r>
-            <w:r>
-              <w:rPr>
-                <w:sz w:val="16"/>
-              </w:rPr>
-              <w:t>nombres]</w:t>
+              <w:t>[Completar apellidos y nombres]</w:t>
             </w:r>
           </w:p>
         </w:tc>
@@ -425,7 +419,21 @@
               <w:rPr>
                 <w:sz w:val="16"/>
               </w:rPr>
-              <w:t>[Completar Direccion Zonal/CFP]</w:t>
+              <w:t xml:space="preserve">[Completar </w:t>
+            </w:r>
+            <w:proofErr w:type="spellStart"/>
+            <w:r>
+              <w:rPr>
+                <w:sz w:val="16"/>
+              </w:rPr>
+              <w:t>Direccion</w:t>
+            </w:r>
+            <w:proofErr w:type="spellEnd"/>
+            <w:r>
+              <w:rPr>
+                <w:sz w:val="16"/>
+              </w:rPr>
+              <w:t xml:space="preserve"> Zonal/CFP]</w:t>
             </w:r>
           </w:p>
         </w:tc>
@@ -476,12 +484,28 @@
             <w:vAlign w:val="center"/>
           </w:tcPr>
           <w:p>
-            <w:r>
-              <w:rPr>
-                <w:sz w:val="16"/>
-              </w:rPr>
-              <w:t>Tecnologias de la Informacion</w:t>
-            </w:r>
+            <w:proofErr w:type="spellStart"/>
+            <w:r>
+              <w:rPr>
+                <w:sz w:val="16"/>
+              </w:rPr>
+              <w:t>Tecnologias</w:t>
+            </w:r>
+            <w:proofErr w:type="spellEnd"/>
+            <w:r>
+              <w:rPr>
+                <w:sz w:val="16"/>
+              </w:rPr>
+              <w:t xml:space="preserve"> de la </w:t>
+            </w:r>
+            <w:proofErr w:type="spellStart"/>
+            <w:r>
+              <w:rPr>
+                <w:sz w:val="16"/>
+              </w:rPr>
+              <w:t>Informacion</w:t>
+            </w:r>
+            <w:proofErr w:type="spellEnd"/>
           </w:p>
         </w:tc>
         <w:tc>
@@ -558,7 +582,25 @@
                 <w:sz w:val="20"/>
                 <w:szCs w:val="20"/>
               </w:rPr>
-              <w:t>Curso/ Mód. Formativo</w:t>
+              <w:t xml:space="preserve">Curso/ </w:t>
+            </w:r>
+            <w:proofErr w:type="spellStart"/>
+            <w:r>
+              <w:rPr>
+                <w:rFonts w:ascii="Arial" w:hAnsi="Arial" w:cs="Arial"/>
+                <w:sz w:val="20"/>
+                <w:szCs w:val="20"/>
+              </w:rPr>
+              <w:t>Mód</w:t>
+            </w:r>
+            <w:proofErr w:type="spellEnd"/>
+            <w:r>
+              <w:rPr>
+                <w:rFonts w:ascii="Arial" w:hAnsi="Arial" w:cs="Arial"/>
+                <w:sz w:val="20"/>
+                <w:szCs w:val="20"/>
+              </w:rPr>
+              <w:t>. Formativo</w:t>
             </w:r>
             <w:r>
               <w:rPr>
@@ -588,7 +630,21 @@
               <w:rPr>
                 <w:sz w:val="16"/>
               </w:rPr>
-              <w:t>AI-900T00 Conceptos Basicos de IA en Microsoft Azure</w:t>
+              <w:t xml:space="preserve">AI-900T00 Conceptos </w:t>
+            </w:r>
+            <w:proofErr w:type="spellStart"/>
+            <w:r>
+              <w:rPr>
+                <w:sz w:val="16"/>
+              </w:rPr>
+              <w:t>Basicos</w:t>
+            </w:r>
+            <w:proofErr w:type="spellEnd"/>
+            <w:r>
+              <w:rPr>
+                <w:sz w:val="16"/>
+              </w:rPr>
+              <w:t xml:space="preserve"> de IA en Microsoft Azure</w:t>
             </w:r>
           </w:p>
         </w:tc>
@@ -660,14 +716,30 @@
               <w:rPr>
                 <w:sz w:val="16"/>
               </w:rPr>
-              <w:t xml:space="preserve">Uso </w:t>
-            </w:r>
-            <w:r>
-              <w:rPr>
-                <w:sz w:val="16"/>
-              </w:rPr>
-              <w:t>de chatbots en E-commerce</w:t>
-            </w:r>
+              <w:t xml:space="preserve">Uso de </w:t>
+            </w:r>
+            <w:proofErr w:type="spellStart"/>
+            <w:r>
+              <w:rPr>
+                <w:sz w:val="16"/>
+              </w:rPr>
+              <w:t>chatbots</w:t>
+            </w:r>
+            <w:proofErr w:type="spellEnd"/>
+            <w:r>
+              <w:rPr>
+                <w:sz w:val="16"/>
+              </w:rPr>
+              <w:t xml:space="preserve"> en E-</w:t>
+            </w:r>
+            <w:proofErr w:type="spellStart"/>
+            <w:r>
+              <w:rPr>
+                <w:sz w:val="16"/>
+              </w:rPr>
+              <w:t>commerce</w:t>
+            </w:r>
+            <w:proofErr w:type="spellEnd"/>
           </w:p>
         </w:tc>
       </w:tr>
@@ -956,13 +1028,23 @@
                                 <w:sz w:val="18"/>
                               </w:rPr>
                             </w:pPr>
+                            <w:proofErr w:type="spellStart"/>
                             <w:r>
                               <w:rPr>
                                 <w:rFonts w:ascii="Arial" w:hAnsi="Arial" w:cs="Arial"/>
                                 <w:color w:val="000000"/>
                                 <w:sz w:val="18"/>
                               </w:rPr>
-                              <w:t>InnovVentas presenta baja interacción en su sitio web y una alta tasa de abandono de carrito. La causa principal es la falta de respuestas rápidas sobre especificaciones, pagos, stock, envíos y soporte. Esta fricción reduce la conversión, afecta la retención y genera pérdidas de ventas en el canal digital.</w:t>
+                              <w:t>InnovVentas</w:t>
+                            </w:r>
+                            <w:proofErr w:type="spellEnd"/>
+                            <w:r>
+                              <w:rPr>
+                                <w:rFonts w:ascii="Arial" w:hAnsi="Arial" w:cs="Arial"/>
+                                <w:color w:val="000000"/>
+                                <w:sz w:val="18"/>
+                              </w:rPr>
+                              <w:t xml:space="preserve"> presenta baja interacción en su sitio web y una alta tasa de abandono de carrito. La causa principal es la falta de respuestas rápidas sobre especificaciones, pagos, stock, envíos y soporte. Esta fricción reduce la conversión, afecta la retención y genera pérdidas de ventas en el canal digital.</w:t>
                             </w:r>
                           </w:p>
                         </w:txbxContent>
@@ -994,13 +1076,23 @@
                           <w:sz w:val="18"/>
                         </w:rPr>
                       </w:pPr>
+                      <w:proofErr w:type="spellStart"/>
                       <w:r>
                         <w:rPr>
                           <w:rFonts w:ascii="Arial" w:hAnsi="Arial" w:cs="Arial"/>
                           <w:color w:val="000000"/>
                           <w:sz w:val="18"/>
                         </w:rPr>
-                        <w:t>InnovVentas presenta baja interacción en su sitio web y una alta tasa de abandono de carrito. La causa principal es la falta de respuestas rápidas sobre especificaciones, pagos, stock, envíos y soporte. Esta fricción reduce la conversión, afecta la retención y genera pérdidas de ventas en el canal digital.</w:t>
+                        <w:t>InnovVentas</w:t>
+                      </w:r>
+                      <w:proofErr w:type="spellEnd"/>
+                      <w:r>
+                        <w:rPr>
+                          <w:rFonts w:ascii="Arial" w:hAnsi="Arial" w:cs="Arial"/>
+                          <w:color w:val="000000"/>
+                          <w:sz w:val="18"/>
+                        </w:rPr>
+                        <w:t xml:space="preserve"> presenta baja interacción en su sitio web y una alta tasa de abandono de carrito. La causa principal es la falta de respuestas rápidas sobre especificaciones, pagos, stock, envíos y soporte. Esta fricción reduce la conversión, afecta la retención y genera pérdidas de ventas en el canal digital.</w:t>
                       </w:r>
                     </w:p>
                   </w:txbxContent>
@@ -1143,7 +1235,100 @@
                                 <w:color w:val="000000"/>
                                 <w:sz w:val="18"/>
                               </w:rPr>
-                              <w:t>Se propone implementar un chatbot 24/7 integrado al e-commerce para responder FAQ, asistir la compra y brindar soporte básico. La solución usará Microsoft Copilot Studio, Azure AI Bot Service/Web Chat, Direct Line y Application Insights. Como evidencias se incluyen respuestas guía, cronograma, recursos, flujo conversacional, arquitectura Azure, pasos de implementación, métricas y evaluación.</w:t>
+                              <w:t xml:space="preserve">Se propone implementar un </w:t>
+                            </w:r>
+                            <w:proofErr w:type="spellStart"/>
+                            <w:r>
+                              <w:rPr>
+                                <w:rFonts w:ascii="Arial" w:hAnsi="Arial" w:cs="Arial"/>
+                                <w:color w:val="000000"/>
+                                <w:sz w:val="18"/>
+                              </w:rPr>
+                              <w:t>chatbot</w:t>
+                            </w:r>
+                            <w:proofErr w:type="spellEnd"/>
+                            <w:r>
+                              <w:rPr>
+                                <w:rFonts w:ascii="Arial" w:hAnsi="Arial" w:cs="Arial"/>
+                                <w:color w:val="000000"/>
+                                <w:sz w:val="18"/>
+                              </w:rPr>
+                              <w:t xml:space="preserve"> 24/7 integrado al e-</w:t>
+                            </w:r>
+                            <w:proofErr w:type="spellStart"/>
+                            <w:r>
+                              <w:rPr>
+                                <w:rFonts w:ascii="Arial" w:hAnsi="Arial" w:cs="Arial"/>
+                                <w:color w:val="000000"/>
+                                <w:sz w:val="18"/>
+                              </w:rPr>
+                              <w:t>commerce</w:t>
+                            </w:r>
+                            <w:proofErr w:type="spellEnd"/>
+                            <w:r>
+                              <w:rPr>
+                                <w:rFonts w:ascii="Arial" w:hAnsi="Arial" w:cs="Arial"/>
+                                <w:color w:val="000000"/>
+                                <w:sz w:val="18"/>
+                              </w:rPr>
+                              <w:t xml:space="preserve"> para responder FAQ, asistir la compra y brindar soporte básico. </w:t>
+                            </w:r>
+                            <w:r>
+                              <w:rPr>
+                                <w:rFonts w:ascii="Arial" w:hAnsi="Arial" w:cs="Arial"/>
+                                <w:color w:val="000000"/>
+                                <w:sz w:val="18"/>
+                                <w:lang w:val="en-US"/>
+                              </w:rPr>
+                              <w:t xml:space="preserve">La </w:t>
+                            </w:r>
+                            <w:proofErr w:type="spellStart"/>
+                            <w:r>
+                              <w:rPr>
+                                <w:rFonts w:ascii="Arial" w:hAnsi="Arial" w:cs="Arial"/>
+                                <w:color w:val="000000"/>
+                                <w:sz w:val="18"/>
+                                <w:lang w:val="en-US"/>
+                              </w:rPr>
+                              <w:t>solución</w:t>
+                            </w:r>
+                            <w:proofErr w:type="spellEnd"/>
+                            <w:r>
+                              <w:rPr>
+                                <w:rFonts w:ascii="Arial" w:hAnsi="Arial" w:cs="Arial"/>
+                                <w:color w:val="000000"/>
+                                <w:sz w:val="18"/>
+                                <w:lang w:val="en-US"/>
+                              </w:rPr>
+                              <w:t xml:space="preserve"> </w:t>
+                            </w:r>
+                            <w:proofErr w:type="spellStart"/>
+                            <w:r>
+                              <w:rPr>
+                                <w:rFonts w:ascii="Arial" w:hAnsi="Arial" w:cs="Arial"/>
+                                <w:color w:val="000000"/>
+                                <w:sz w:val="18"/>
+                                <w:lang w:val="en-US"/>
+                              </w:rPr>
+                              <w:t>usará</w:t>
+                            </w:r>
+                            <w:proofErr w:type="spellEnd"/>
+                            <w:r>
+                              <w:rPr>
+                                <w:rFonts w:ascii="Arial" w:hAnsi="Arial" w:cs="Arial"/>
+                                <w:color w:val="000000"/>
+                                <w:sz w:val="18"/>
+                                <w:lang w:val="en-US"/>
+                              </w:rPr>
+                              <w:t xml:space="preserve"> Microsoft Copilot Studio, Azure AI Bot Service/Web Chat, Direct Line y Application Insights. </w:t>
+                            </w:r>
+                            <w:r>
+                              <w:rPr>
+                                <w:rFonts w:ascii="Arial" w:hAnsi="Arial" w:cs="Arial"/>
+                                <w:color w:val="000000"/>
+                                <w:sz w:val="18"/>
+                              </w:rPr>
+                              <w:t>Como evidencias se incluyen respuestas guía, cronograma, recursos, flujo conversacional, arquitectura Azure, pasos de implementación, métricas y evaluación.</w:t>
                             </w:r>
                           </w:p>
                         </w:txbxContent>
@@ -1181,7 +1366,100 @@
                           <w:color w:val="000000"/>
                           <w:sz w:val="18"/>
                         </w:rPr>
-                        <w:t>Se propone implementar un chatbot 24/7 integrado al e-commerce para responder FAQ, asistir la compra y brindar soporte básico. La solución usará Microsoft Copilot Studio, Azure AI Bot Service/Web Chat, Direct Line y Application Insights. Como evidencias se incluyen respuestas guía, cronograma, recursos, flujo conversacional, arquitectura Azure, pasos de implementación, métricas y evaluación.</w:t>
+                        <w:t xml:space="preserve">Se propone implementar un </w:t>
+                      </w:r>
+                      <w:proofErr w:type="spellStart"/>
+                      <w:r>
+                        <w:rPr>
+                          <w:rFonts w:ascii="Arial" w:hAnsi="Arial" w:cs="Arial"/>
+                          <w:color w:val="000000"/>
+                          <w:sz w:val="18"/>
+                        </w:rPr>
+                        <w:t>chatbot</w:t>
+                      </w:r>
+                      <w:proofErr w:type="spellEnd"/>
+                      <w:r>
+                        <w:rPr>
+                          <w:rFonts w:ascii="Arial" w:hAnsi="Arial" w:cs="Arial"/>
+                          <w:color w:val="000000"/>
+                          <w:sz w:val="18"/>
+                        </w:rPr>
+                        <w:t xml:space="preserve"> 24/7 integrado al e-</w:t>
+                      </w:r>
+                      <w:proofErr w:type="spellStart"/>
+                      <w:r>
+                        <w:rPr>
+                          <w:rFonts w:ascii="Arial" w:hAnsi="Arial" w:cs="Arial"/>
+                          <w:color w:val="000000"/>
+                          <w:sz w:val="18"/>
+                        </w:rPr>
+                        <w:t>commerce</w:t>
+                      </w:r>
+                      <w:proofErr w:type="spellEnd"/>
+                      <w:r>
+                        <w:rPr>
+                          <w:rFonts w:ascii="Arial" w:hAnsi="Arial" w:cs="Arial"/>
+                          <w:color w:val="000000"/>
+                          <w:sz w:val="18"/>
+                        </w:rPr>
+                        <w:t xml:space="preserve"> para responder FAQ, asistir la compra y brindar soporte básico. </w:t>
+                      </w:r>
+                      <w:r>
+                        <w:rPr>
+                          <w:rFonts w:ascii="Arial" w:hAnsi="Arial" w:cs="Arial"/>
+                          <w:color w:val="000000"/>
+                          <w:sz w:val="18"/>
+                          <w:lang w:val="en-US"/>
+                        </w:rPr>
+                        <w:t xml:space="preserve">La </w:t>
+                      </w:r>
+                      <w:proofErr w:type="spellStart"/>
+                      <w:r>
+                        <w:rPr>
+                          <w:rFonts w:ascii="Arial" w:hAnsi="Arial" w:cs="Arial"/>
+                          <w:color w:val="000000"/>
+                          <w:sz w:val="18"/>
+                          <w:lang w:val="en-US"/>
+                        </w:rPr>
+                        <w:t>solución</w:t>
+                      </w:r>
+                      <w:proofErr w:type="spellEnd"/>
+                      <w:r>
+                        <w:rPr>
+                          <w:rFonts w:ascii="Arial" w:hAnsi="Arial" w:cs="Arial"/>
+                          <w:color w:val="000000"/>
+                          <w:sz w:val="18"/>
+                          <w:lang w:val="en-US"/>
+                        </w:rPr>
+                        <w:t xml:space="preserve"> </w:t>
+                      </w:r>
+                      <w:proofErr w:type="spellStart"/>
+                      <w:r>
+                        <w:rPr>
+                          <w:rFonts w:ascii="Arial" w:hAnsi="Arial" w:cs="Arial"/>
+                          <w:color w:val="000000"/>
+                          <w:sz w:val="18"/>
+                          <w:lang w:val="en-US"/>
+                        </w:rPr>
+                        <w:t>usará</w:t>
+                      </w:r>
+                      <w:proofErr w:type="spellEnd"/>
+                      <w:r>
+                        <w:rPr>
+                          <w:rFonts w:ascii="Arial" w:hAnsi="Arial" w:cs="Arial"/>
+                          <w:color w:val="000000"/>
+                          <w:sz w:val="18"/>
+                          <w:lang w:val="en-US"/>
+                        </w:rPr>
+                        <w:t xml:space="preserve"> Microsoft Copilot Studio, Azure AI Bot Service/Web Chat, Direct Line y Application Insights. </w:t>
+                      </w:r>
+                      <w:r>
+                        <w:rPr>
+                          <w:rFonts w:ascii="Arial" w:hAnsi="Arial" w:cs="Arial"/>
+                          <w:color w:val="000000"/>
+                          <w:sz w:val="18"/>
+                        </w:rPr>
+                        <w:t>Como evidencias se incluyen respuestas guía, cronograma, recursos, flujo conversacional, arquitectura Azure, pasos de implementación, métricas y evaluación.</w:t>
                       </w:r>
                     </w:p>
                   </w:txbxContent>
@@ -1236,6 +1514,7 @@
           <w:bCs/>
           <w:sz w:val="20"/>
         </w:rPr>
+        <w:lastRenderedPageBreak/>
         <w:t xml:space="preserve">Respuestas a </w:t>
       </w:r>
       <w:r>
@@ -1407,14 +1686,55 @@
                 <w:b/>
                 <w:sz w:val="16"/>
               </w:rPr>
-              <w:t xml:space="preserve">Pregunta 01: ¿Cuales son las preguntas frecuentes mas comunes que </w:t>
-            </w:r>
+              <w:t>Pregunta 01: ¿</w:t>
+            </w:r>
+            <w:proofErr w:type="spellStart"/>
             <w:r>
               <w:rPr>
                 <w:b/>
                 <w:sz w:val="16"/>
               </w:rPr>
-              <w:t>enfrentan los clientes al usar el sitio web de InnovVentas?</w:t>
+              <w:t>Cuales</w:t>
+            </w:r>
+            <w:proofErr w:type="spellEnd"/>
+            <w:r>
+              <w:rPr>
+                <w:b/>
+                <w:sz w:val="16"/>
+              </w:rPr>
+              <w:t xml:space="preserve"> son las preguntas frecuentes </w:t>
+            </w:r>
+            <w:proofErr w:type="spellStart"/>
+            <w:r>
+              <w:rPr>
+                <w:b/>
+                <w:sz w:val="16"/>
+              </w:rPr>
+              <w:t>mas</w:t>
+            </w:r>
+            <w:proofErr w:type="spellEnd"/>
+            <w:r>
+              <w:rPr>
+                <w:b/>
+                <w:sz w:val="16"/>
+              </w:rPr>
+              <w:t xml:space="preserve"> comunes que enfrentan los clientes al usar el sitio web de </w:t>
+            </w:r>
+            <w:proofErr w:type="spellStart"/>
+            <w:r>
+              <w:rPr>
+                <w:b/>
+                <w:sz w:val="16"/>
+              </w:rPr>
+              <w:t>InnovVentas</w:t>
+            </w:r>
+            <w:proofErr w:type="spellEnd"/>
+            <w:r>
+              <w:rPr>
+                <w:b/>
+                <w:sz w:val="16"/>
+              </w:rPr>
+              <w:t>?</w:t>
             </w:r>
           </w:p>
         </w:tc>
@@ -1457,13 +1777,133 @@
               <w:rPr>
                 <w:sz w:val="16"/>
               </w:rPr>
-              <w:t xml:space="preserve">Las consultas mas frecuentes se concentran en disponibilidad de stock, especificaciones tecnicas, metodos de pago, tiempos de envio, garantias, cambios/devoluciones, seguimiento de </w:t>
-            </w:r>
-            <w:r>
-              <w:rPr>
-                <w:sz w:val="16"/>
-              </w:rPr>
-              <w:t>pedidos y soporte tecnico basico. Tambien aparecen preguntas comparativas como 'que laptop me conviene para estudiar' o 'que celular tiene mejor bateria'. Estas consultas deben priorizarse porque ocurren justo antes de agregar al carrito o completar el pago, momento donde la falta de respuesta inmediata genera abandono.</w:t>
+              <w:t xml:space="preserve">Las consultas </w:t>
+            </w:r>
+            <w:proofErr w:type="spellStart"/>
+            <w:r>
+              <w:rPr>
+                <w:sz w:val="16"/>
+              </w:rPr>
+              <w:t>mas</w:t>
+            </w:r>
+            <w:proofErr w:type="spellEnd"/>
+            <w:r>
+              <w:rPr>
+                <w:sz w:val="16"/>
+              </w:rPr>
+              <w:t xml:space="preserve"> frecuentes se concentran en disponibilidad de stock, especificaciones </w:t>
+            </w:r>
+            <w:proofErr w:type="spellStart"/>
+            <w:r>
+              <w:rPr>
+                <w:sz w:val="16"/>
+              </w:rPr>
+              <w:t>tecnicas</w:t>
+            </w:r>
+            <w:proofErr w:type="spellEnd"/>
+            <w:r>
+              <w:rPr>
+                <w:sz w:val="16"/>
+              </w:rPr>
+              <w:t xml:space="preserve">, </w:t>
+            </w:r>
+            <w:proofErr w:type="spellStart"/>
+            <w:r>
+              <w:rPr>
+                <w:sz w:val="16"/>
+              </w:rPr>
+              <w:t>metodos</w:t>
+            </w:r>
+            <w:proofErr w:type="spellEnd"/>
+            <w:r>
+              <w:rPr>
+                <w:sz w:val="16"/>
+              </w:rPr>
+              <w:t xml:space="preserve"> de pago, tiempos de </w:t>
+            </w:r>
+            <w:proofErr w:type="spellStart"/>
+            <w:r>
+              <w:rPr>
+                <w:sz w:val="16"/>
+              </w:rPr>
+              <w:t>envio</w:t>
+            </w:r>
+            <w:proofErr w:type="spellEnd"/>
+            <w:r>
+              <w:rPr>
+                <w:sz w:val="16"/>
+              </w:rPr>
+              <w:t xml:space="preserve">, </w:t>
+            </w:r>
+            <w:proofErr w:type="spellStart"/>
+            <w:r>
+              <w:rPr>
+                <w:sz w:val="16"/>
+              </w:rPr>
+              <w:t>garantias</w:t>
+            </w:r>
+            <w:proofErr w:type="spellEnd"/>
+            <w:r>
+              <w:rPr>
+                <w:sz w:val="16"/>
+              </w:rPr>
+              <w:t xml:space="preserve">, cambios/devoluciones, seguimiento de pedidos y soporte </w:t>
+            </w:r>
+            <w:proofErr w:type="spellStart"/>
+            <w:r>
+              <w:rPr>
+                <w:sz w:val="16"/>
+              </w:rPr>
+              <w:t>tecnico</w:t>
+            </w:r>
+            <w:proofErr w:type="spellEnd"/>
+            <w:r>
+              <w:rPr>
+                <w:sz w:val="16"/>
+              </w:rPr>
+              <w:t xml:space="preserve"> </w:t>
+            </w:r>
+            <w:proofErr w:type="spellStart"/>
+            <w:r>
+              <w:rPr>
+                <w:sz w:val="16"/>
+              </w:rPr>
+              <w:t>basico</w:t>
+            </w:r>
+            <w:proofErr w:type="spellEnd"/>
+            <w:r>
+              <w:rPr>
+                <w:sz w:val="16"/>
+              </w:rPr>
+              <w:t xml:space="preserve">. </w:t>
+            </w:r>
+            <w:proofErr w:type="spellStart"/>
+            <w:r>
+              <w:rPr>
+                <w:sz w:val="16"/>
+              </w:rPr>
+              <w:t>Tambien</w:t>
+            </w:r>
+            <w:proofErr w:type="spellEnd"/>
+            <w:r>
+              <w:rPr>
+                <w:sz w:val="16"/>
+              </w:rPr>
+              <w:t xml:space="preserve"> aparecen preguntas comparativas como 'que laptop me conviene para estudiar' o 'que celular tiene mejor </w:t>
+            </w:r>
+            <w:proofErr w:type="spellStart"/>
+            <w:r>
+              <w:rPr>
+                <w:sz w:val="16"/>
+              </w:rPr>
+              <w:t>bateria</w:t>
+            </w:r>
+            <w:proofErr w:type="spellEnd"/>
+            <w:r>
+              <w:rPr>
+                <w:sz w:val="16"/>
+              </w:rPr>
+              <w:t>'. Estas consultas deben priorizarse porque ocurren justo antes de agregar al carrito o completar el pago, momento donde la falta de respuesta inmediata genera abandono.</w:t>
             </w:r>
           </w:p>
         </w:tc>
@@ -1491,7 +1931,39 @@
                 <w:b/>
                 <w:sz w:val="16"/>
               </w:rPr>
-              <w:t>Pregunta 02: ¿Que herramientas o plataformas son mas adecuadas para desarrollar e integrar el chatbot al sitio web?</w:t>
+              <w:t xml:space="preserve">Pregunta 02: ¿Que herramientas o plataformas son </w:t>
+            </w:r>
+            <w:proofErr w:type="spellStart"/>
+            <w:r>
+              <w:rPr>
+                <w:b/>
+                <w:sz w:val="16"/>
+              </w:rPr>
+              <w:t>mas</w:t>
+            </w:r>
+            <w:proofErr w:type="spellEnd"/>
+            <w:r>
+              <w:rPr>
+                <w:b/>
+                <w:sz w:val="16"/>
+              </w:rPr>
+              <w:t xml:space="preserve"> adecuadas para desarrollar e integrar el </w:t>
+            </w:r>
+            <w:proofErr w:type="spellStart"/>
+            <w:r>
+              <w:rPr>
+                <w:b/>
+                <w:sz w:val="16"/>
+              </w:rPr>
+              <w:t>chatbot</w:t>
+            </w:r>
+            <w:proofErr w:type="spellEnd"/>
+            <w:r>
+              <w:rPr>
+                <w:b/>
+                <w:sz w:val="16"/>
+              </w:rPr>
+              <w:t xml:space="preserve"> al sitio web?</w:t>
             </w:r>
           </w:p>
         </w:tc>
@@ -1534,13 +2006,189 @@
               <w:rPr>
                 <w:sz w:val="16"/>
               </w:rPr>
-              <w:t xml:space="preserve">La solucion recomendada es Microsoft Copilot Studio para </w:t>
-            </w:r>
-            <w:r>
-              <w:rPr>
-                <w:sz w:val="16"/>
-              </w:rPr>
-              <w:t>construir el agente con bajo codigo, temas guiados, respuestas generativas basadas en fuentes de conocimiento y conexion con acciones. Para una integracion web mas personalizada se propone Azure AI Bot Service con Bot Framework Web Chat y canal Direct Line. Application Insights/Azure Monitor permitira registrar disponibilidad, uso, errores e interacciones del bot. Esta combinacion aprovecha servicios Azure, reduce tiempo de implementacion y permite evolucionar desde FAQ hacia asistencia transaccional.</w:t>
+              <w:t xml:space="preserve">La </w:t>
+            </w:r>
+            <w:proofErr w:type="spellStart"/>
+            <w:r>
+              <w:rPr>
+                <w:sz w:val="16"/>
+              </w:rPr>
+              <w:t>solucion</w:t>
+            </w:r>
+            <w:proofErr w:type="spellEnd"/>
+            <w:r>
+              <w:rPr>
+                <w:sz w:val="16"/>
+              </w:rPr>
+              <w:t xml:space="preserve"> recomendada es Microsoft </w:t>
+            </w:r>
+            <w:proofErr w:type="spellStart"/>
+            <w:r>
+              <w:rPr>
+                <w:sz w:val="16"/>
+              </w:rPr>
+              <w:t>Copilot</w:t>
+            </w:r>
+            <w:proofErr w:type="spellEnd"/>
+            <w:r>
+              <w:rPr>
+                <w:sz w:val="16"/>
+              </w:rPr>
+              <w:t xml:space="preserve"> Studio para construir el agente con bajo </w:t>
+            </w:r>
+            <w:proofErr w:type="spellStart"/>
+            <w:r>
+              <w:rPr>
+                <w:sz w:val="16"/>
+              </w:rPr>
+              <w:t>codigo</w:t>
+            </w:r>
+            <w:proofErr w:type="spellEnd"/>
+            <w:r>
+              <w:rPr>
+                <w:sz w:val="16"/>
+              </w:rPr>
+              <w:t xml:space="preserve">, temas guiados, respuestas generativas basadas en fuentes de conocimiento y </w:t>
+            </w:r>
+            <w:proofErr w:type="spellStart"/>
+            <w:r>
+              <w:rPr>
+                <w:sz w:val="16"/>
+              </w:rPr>
+              <w:t>conexion</w:t>
+            </w:r>
+            <w:proofErr w:type="spellEnd"/>
+            <w:r>
+              <w:rPr>
+                <w:sz w:val="16"/>
+              </w:rPr>
+              <w:t xml:space="preserve"> con acciones. Para una </w:t>
+            </w:r>
+            <w:proofErr w:type="spellStart"/>
+            <w:r>
+              <w:rPr>
+                <w:sz w:val="16"/>
+              </w:rPr>
+              <w:t>integracion</w:t>
+            </w:r>
+            <w:proofErr w:type="spellEnd"/>
+            <w:r>
+              <w:rPr>
+                <w:sz w:val="16"/>
+              </w:rPr>
+              <w:t xml:space="preserve"> web </w:t>
+            </w:r>
+            <w:proofErr w:type="spellStart"/>
+            <w:r>
+              <w:rPr>
+                <w:sz w:val="16"/>
+              </w:rPr>
+              <w:t>mas</w:t>
+            </w:r>
+            <w:proofErr w:type="spellEnd"/>
+            <w:r>
+              <w:rPr>
+                <w:sz w:val="16"/>
+              </w:rPr>
+              <w:t xml:space="preserve"> personalizada se propone Azure AI Bot </w:t>
+            </w:r>
+            <w:proofErr w:type="spellStart"/>
+            <w:r>
+              <w:rPr>
+                <w:sz w:val="16"/>
+              </w:rPr>
+              <w:t>Service</w:t>
+            </w:r>
+            <w:proofErr w:type="spellEnd"/>
+            <w:r>
+              <w:rPr>
+                <w:sz w:val="16"/>
+              </w:rPr>
+              <w:t xml:space="preserve"> con Bot Framework Web Chat y canal Direct Line. </w:t>
+            </w:r>
+            <w:proofErr w:type="spellStart"/>
+            <w:r>
+              <w:rPr>
+                <w:sz w:val="16"/>
+              </w:rPr>
+              <w:t>Application</w:t>
+            </w:r>
+            <w:proofErr w:type="spellEnd"/>
+            <w:r>
+              <w:rPr>
+                <w:sz w:val="16"/>
+              </w:rPr>
+              <w:t xml:space="preserve"> </w:t>
+            </w:r>
+            <w:proofErr w:type="spellStart"/>
+            <w:r>
+              <w:rPr>
+                <w:sz w:val="16"/>
+              </w:rPr>
+              <w:t>Insights</w:t>
+            </w:r>
+            <w:proofErr w:type="spellEnd"/>
+            <w:r>
+              <w:rPr>
+                <w:sz w:val="16"/>
+              </w:rPr>
+              <w:t xml:space="preserve">/Azure Monitor </w:t>
+            </w:r>
+            <w:proofErr w:type="spellStart"/>
+            <w:r>
+              <w:rPr>
+                <w:sz w:val="16"/>
+              </w:rPr>
+              <w:t>permitira</w:t>
+            </w:r>
+            <w:proofErr w:type="spellEnd"/>
+            <w:r>
+              <w:rPr>
+                <w:sz w:val="16"/>
+              </w:rPr>
+              <w:t xml:space="preserve"> registrar disponibilidad, uso, errores e interacciones del </w:t>
+            </w:r>
+            <w:proofErr w:type="spellStart"/>
+            <w:r>
+              <w:rPr>
+                <w:sz w:val="16"/>
+              </w:rPr>
+              <w:t>bot</w:t>
+            </w:r>
+            <w:proofErr w:type="spellEnd"/>
+            <w:r>
+              <w:rPr>
+                <w:sz w:val="16"/>
+              </w:rPr>
+              <w:t xml:space="preserve">. Esta </w:t>
+            </w:r>
+            <w:proofErr w:type="spellStart"/>
+            <w:r>
+              <w:rPr>
+                <w:sz w:val="16"/>
+              </w:rPr>
+              <w:t>combinacion</w:t>
+            </w:r>
+            <w:proofErr w:type="spellEnd"/>
+            <w:r>
+              <w:rPr>
+                <w:sz w:val="16"/>
+              </w:rPr>
+              <w:t xml:space="preserve"> aprovecha servicios Azure, reduce tiempo de </w:t>
+            </w:r>
+            <w:proofErr w:type="spellStart"/>
+            <w:r>
+              <w:rPr>
+                <w:sz w:val="16"/>
+              </w:rPr>
+              <w:t>implementacion</w:t>
+            </w:r>
+            <w:proofErr w:type="spellEnd"/>
+            <w:r>
+              <w:rPr>
+                <w:sz w:val="16"/>
+              </w:rPr>
+              <w:t xml:space="preserve"> y permite evolucionar desde FAQ hacia asistencia transaccional.</w:t>
             </w:r>
           </w:p>
         </w:tc>
@@ -1568,7 +2216,55 @@
                 <w:b/>
                 <w:sz w:val="16"/>
               </w:rPr>
-              <w:t>Pregunta 03: ¿Como se puede evaluar la efectividad del chatbot en terminos de satisfaccion del cliente y aumento de ventas?</w:t>
+              <w:t xml:space="preserve">Pregunta 03: ¿Como se puede evaluar la efectividad del </w:t>
+            </w:r>
+            <w:proofErr w:type="spellStart"/>
+            <w:r>
+              <w:rPr>
+                <w:b/>
+                <w:sz w:val="16"/>
+              </w:rPr>
+              <w:t>chatbot</w:t>
+            </w:r>
+            <w:proofErr w:type="spellEnd"/>
+            <w:r>
+              <w:rPr>
+                <w:b/>
+                <w:sz w:val="16"/>
+              </w:rPr>
+              <w:t xml:space="preserve"> en </w:t>
+            </w:r>
+            <w:proofErr w:type="spellStart"/>
+            <w:r>
+              <w:rPr>
+                <w:b/>
+                <w:sz w:val="16"/>
+              </w:rPr>
+              <w:t>terminos</w:t>
+            </w:r>
+            <w:proofErr w:type="spellEnd"/>
+            <w:r>
+              <w:rPr>
+                <w:b/>
+                <w:sz w:val="16"/>
+              </w:rPr>
+              <w:t xml:space="preserve"> de </w:t>
+            </w:r>
+            <w:proofErr w:type="spellStart"/>
+            <w:r>
+              <w:rPr>
+                <w:b/>
+                <w:sz w:val="16"/>
+              </w:rPr>
+              <w:t>satisfaccion</w:t>
+            </w:r>
+            <w:proofErr w:type="spellEnd"/>
+            <w:r>
+              <w:rPr>
+                <w:b/>
+                <w:sz w:val="16"/>
+              </w:rPr>
+              <w:t xml:space="preserve"> del cliente y aumento de ventas?</w:t>
             </w:r>
           </w:p>
         </w:tc>
@@ -1611,13 +2307,133 @@
               <w:rPr>
                 <w:sz w:val="16"/>
               </w:rPr>
-              <w:t xml:space="preserve">La efectividad debe medirse comparando una linea base previa contra indicadores posteriores a la implementacion. Para satisfaccion: CSAT al cierre de la conversacion, porcentaje de conversaciones resueltas sin agente humano, tiempo medio de respuesta y tasa de escalamiento. Para ventas: conversion de usuarios que interactuaron con el chatbot, reduccion de carritos abandonados, productos agregados al carrito luego de una recomendacion y valor promedio de pedido. Se recomienda revisar resultados semanalmente </w:t>
-            </w:r>
-            <w:r>
-              <w:rPr>
-                <w:sz w:val="16"/>
-              </w:rPr>
-              <w:t>durante el piloto y mensualmente en produccion.</w:t>
+              <w:t xml:space="preserve">La efectividad debe medirse comparando una </w:t>
+            </w:r>
+            <w:proofErr w:type="spellStart"/>
+            <w:r>
+              <w:rPr>
+                <w:sz w:val="16"/>
+              </w:rPr>
+              <w:t>linea</w:t>
+            </w:r>
+            <w:proofErr w:type="spellEnd"/>
+            <w:r>
+              <w:rPr>
+                <w:sz w:val="16"/>
+              </w:rPr>
+              <w:t xml:space="preserve"> base previa contra indicadores posteriores a la </w:t>
+            </w:r>
+            <w:proofErr w:type="spellStart"/>
+            <w:r>
+              <w:rPr>
+                <w:sz w:val="16"/>
+              </w:rPr>
+              <w:t>implementacion</w:t>
+            </w:r>
+            <w:proofErr w:type="spellEnd"/>
+            <w:r>
+              <w:rPr>
+                <w:sz w:val="16"/>
+              </w:rPr>
+              <w:t xml:space="preserve">. Para </w:t>
+            </w:r>
+            <w:proofErr w:type="spellStart"/>
+            <w:r>
+              <w:rPr>
+                <w:sz w:val="16"/>
+              </w:rPr>
+              <w:t>satisfaccion</w:t>
+            </w:r>
+            <w:proofErr w:type="spellEnd"/>
+            <w:r>
+              <w:rPr>
+                <w:sz w:val="16"/>
+              </w:rPr>
+              <w:t xml:space="preserve">: CSAT al cierre de la </w:t>
+            </w:r>
+            <w:proofErr w:type="spellStart"/>
+            <w:r>
+              <w:rPr>
+                <w:sz w:val="16"/>
+              </w:rPr>
+              <w:t>conversacion</w:t>
+            </w:r>
+            <w:proofErr w:type="spellEnd"/>
+            <w:r>
+              <w:rPr>
+                <w:sz w:val="16"/>
+              </w:rPr>
+              <w:t xml:space="preserve">, porcentaje de conversaciones resueltas sin agente humano, tiempo medio de respuesta y tasa de escalamiento. Para ventas: </w:t>
+            </w:r>
+            <w:proofErr w:type="spellStart"/>
+            <w:r>
+              <w:rPr>
+                <w:sz w:val="16"/>
+              </w:rPr>
+              <w:t>conversion</w:t>
+            </w:r>
+            <w:proofErr w:type="spellEnd"/>
+            <w:r>
+              <w:rPr>
+                <w:sz w:val="16"/>
+              </w:rPr>
+              <w:t xml:space="preserve"> de usuarios que interactuaron con el </w:t>
+            </w:r>
+            <w:proofErr w:type="spellStart"/>
+            <w:r>
+              <w:rPr>
+                <w:sz w:val="16"/>
+              </w:rPr>
+              <w:t>chatbot</w:t>
+            </w:r>
+            <w:proofErr w:type="spellEnd"/>
+            <w:r>
+              <w:rPr>
+                <w:sz w:val="16"/>
+              </w:rPr>
+              <w:t xml:space="preserve">, </w:t>
+            </w:r>
+            <w:proofErr w:type="spellStart"/>
+            <w:r>
+              <w:rPr>
+                <w:sz w:val="16"/>
+              </w:rPr>
+              <w:t>reduccion</w:t>
+            </w:r>
+            <w:proofErr w:type="spellEnd"/>
+            <w:r>
+              <w:rPr>
+                <w:sz w:val="16"/>
+              </w:rPr>
+              <w:t xml:space="preserve"> de carritos abandonados, productos agregados al carrito luego de una </w:t>
+            </w:r>
+            <w:proofErr w:type="spellStart"/>
+            <w:r>
+              <w:rPr>
+                <w:sz w:val="16"/>
+              </w:rPr>
+              <w:t>recomendacion</w:t>
+            </w:r>
+            <w:proofErr w:type="spellEnd"/>
+            <w:r>
+              <w:rPr>
+                <w:sz w:val="16"/>
+              </w:rPr>
+              <w:t xml:space="preserve"> y valor promedio de pedido. Se recomienda revisar resultados semanalmente durante el piloto y mensualmente en </w:t>
+            </w:r>
+            <w:proofErr w:type="spellStart"/>
+            <w:r>
+              <w:rPr>
+                <w:sz w:val="16"/>
+              </w:rPr>
+              <w:t>produccion</w:t>
+            </w:r>
+            <w:proofErr w:type="spellEnd"/>
+            <w:r>
+              <w:rPr>
+                <w:sz w:val="16"/>
+              </w:rPr>
+              <w:t>.</w:t>
             </w:r>
           </w:p>
         </w:tc>
@@ -1645,14 +2461,103 @@
                 <w:b/>
                 <w:sz w:val="16"/>
               </w:rPr>
-              <w:t xml:space="preserve">Pregunta 04: ¿Que desafios tecnicos podrian surgir durante la </w:t>
-            </w:r>
+              <w:t xml:space="preserve">Pregunta 04: ¿Que </w:t>
+            </w:r>
+            <w:proofErr w:type="spellStart"/>
             <w:r>
               <w:rPr>
                 <w:b/>
                 <w:sz w:val="16"/>
               </w:rPr>
-              <w:t>implementacion del chatbot y como podrian resolverse?</w:t>
+              <w:t>desafios</w:t>
+            </w:r>
+            <w:proofErr w:type="spellEnd"/>
+            <w:r>
+              <w:rPr>
+                <w:b/>
+                <w:sz w:val="16"/>
+              </w:rPr>
+              <w:t xml:space="preserve"> </w:t>
+            </w:r>
+            <w:proofErr w:type="spellStart"/>
+            <w:r>
+              <w:rPr>
+                <w:b/>
+                <w:sz w:val="16"/>
+              </w:rPr>
+              <w:t>tecnicos</w:t>
+            </w:r>
+            <w:proofErr w:type="spellEnd"/>
+            <w:r>
+              <w:rPr>
+                <w:b/>
+                <w:sz w:val="16"/>
+              </w:rPr>
+              <w:t xml:space="preserve"> </w:t>
+            </w:r>
+            <w:proofErr w:type="spellStart"/>
+            <w:r>
+              <w:rPr>
+                <w:b/>
+                <w:sz w:val="16"/>
+              </w:rPr>
+              <w:t>podrian</w:t>
+            </w:r>
+            <w:proofErr w:type="spellEnd"/>
+            <w:r>
+              <w:rPr>
+                <w:b/>
+                <w:sz w:val="16"/>
+              </w:rPr>
+              <w:t xml:space="preserve"> surgir durante la </w:t>
+            </w:r>
+            <w:proofErr w:type="spellStart"/>
+            <w:r>
+              <w:rPr>
+                <w:b/>
+                <w:sz w:val="16"/>
+              </w:rPr>
+              <w:t>implementacion</w:t>
+            </w:r>
+            <w:proofErr w:type="spellEnd"/>
+            <w:r>
+              <w:rPr>
+                <w:b/>
+                <w:sz w:val="16"/>
+              </w:rPr>
+              <w:t xml:space="preserve"> del </w:t>
+            </w:r>
+            <w:proofErr w:type="spellStart"/>
+            <w:r>
+              <w:rPr>
+                <w:b/>
+                <w:sz w:val="16"/>
+              </w:rPr>
+              <w:t>chatbot</w:t>
+            </w:r>
+            <w:proofErr w:type="spellEnd"/>
+            <w:r>
+              <w:rPr>
+                <w:b/>
+                <w:sz w:val="16"/>
+              </w:rPr>
+              <w:t xml:space="preserve"> y como </w:t>
+            </w:r>
+            <w:proofErr w:type="spellStart"/>
+            <w:r>
+              <w:rPr>
+                <w:b/>
+                <w:sz w:val="16"/>
+              </w:rPr>
+              <w:t>podrian</w:t>
+            </w:r>
+            <w:proofErr w:type="spellEnd"/>
+            <w:r>
+              <w:rPr>
+                <w:b/>
+                <w:sz w:val="16"/>
+              </w:rPr>
+              <w:t xml:space="preserve"> resolverse?</w:t>
             </w:r>
           </w:p>
         </w:tc>
@@ -1695,13 +2600,133 @@
               <w:rPr>
                 <w:sz w:val="16"/>
               </w:rPr>
-              <w:t>Los principales desafios son mantener actualizado el catalogo, proteger datos personales, integrar el bot con sistemas de stock/pedidos, evitar respuestas imprecisas y medir correctamente el impacto comercial. Para resolverlos se propone conectar el bot a APIs o base de datos de productos, aplicar autenticacion solo cuando sea necesaria, definir temas criticos con respuestas controladas, usar fuentes de conocimiento verificadas, activar escalamiento a soporte humano y monitorear errores con Application Insi</w:t>
-            </w:r>
-            <w:r>
-              <w:rPr>
-                <w:sz w:val="16"/>
-              </w:rPr>
-              <w:t>ghts.</w:t>
+              <w:t xml:space="preserve">Los principales </w:t>
+            </w:r>
+            <w:proofErr w:type="spellStart"/>
+            <w:r>
+              <w:rPr>
+                <w:sz w:val="16"/>
+              </w:rPr>
+              <w:t>desafios</w:t>
+            </w:r>
+            <w:proofErr w:type="spellEnd"/>
+            <w:r>
+              <w:rPr>
+                <w:sz w:val="16"/>
+              </w:rPr>
+              <w:t xml:space="preserve"> son mantener actualizado el </w:t>
+            </w:r>
+            <w:proofErr w:type="spellStart"/>
+            <w:r>
+              <w:rPr>
+                <w:sz w:val="16"/>
+              </w:rPr>
+              <w:t>catalogo</w:t>
+            </w:r>
+            <w:proofErr w:type="spellEnd"/>
+            <w:r>
+              <w:rPr>
+                <w:sz w:val="16"/>
+              </w:rPr>
+              <w:t xml:space="preserve">, proteger datos personales, integrar el </w:t>
+            </w:r>
+            <w:proofErr w:type="spellStart"/>
+            <w:r>
+              <w:rPr>
+                <w:sz w:val="16"/>
+              </w:rPr>
+              <w:t>bot</w:t>
+            </w:r>
+            <w:proofErr w:type="spellEnd"/>
+            <w:r>
+              <w:rPr>
+                <w:sz w:val="16"/>
+              </w:rPr>
+              <w:t xml:space="preserve"> con sistemas de stock/pedidos, evitar respuestas imprecisas y medir correctamente el impacto comercial. Para resolverlos se propone conectar el </w:t>
+            </w:r>
+            <w:proofErr w:type="spellStart"/>
+            <w:r>
+              <w:rPr>
+                <w:sz w:val="16"/>
+              </w:rPr>
+              <w:t>bot</w:t>
+            </w:r>
+            <w:proofErr w:type="spellEnd"/>
+            <w:r>
+              <w:rPr>
+                <w:sz w:val="16"/>
+              </w:rPr>
+              <w:t xml:space="preserve"> a </w:t>
+            </w:r>
+            <w:proofErr w:type="spellStart"/>
+            <w:r>
+              <w:rPr>
+                <w:sz w:val="16"/>
+              </w:rPr>
+              <w:t>APIs</w:t>
+            </w:r>
+            <w:proofErr w:type="spellEnd"/>
+            <w:r>
+              <w:rPr>
+                <w:sz w:val="16"/>
+              </w:rPr>
+              <w:t xml:space="preserve"> o base de datos de productos, aplicar </w:t>
+            </w:r>
+            <w:proofErr w:type="spellStart"/>
+            <w:r>
+              <w:rPr>
+                <w:sz w:val="16"/>
+              </w:rPr>
+              <w:t>autenticacion</w:t>
+            </w:r>
+            <w:proofErr w:type="spellEnd"/>
+            <w:r>
+              <w:rPr>
+                <w:sz w:val="16"/>
+              </w:rPr>
+              <w:t xml:space="preserve"> solo cuando sea necesaria, definir temas </w:t>
+            </w:r>
+            <w:proofErr w:type="spellStart"/>
+            <w:r>
+              <w:rPr>
+                <w:sz w:val="16"/>
+              </w:rPr>
+              <w:t>criticos</w:t>
+            </w:r>
+            <w:proofErr w:type="spellEnd"/>
+            <w:r>
+              <w:rPr>
+                <w:sz w:val="16"/>
+              </w:rPr>
+              <w:t xml:space="preserve"> con respuestas controladas, usar fuentes de conocimiento verificadas, activar escalamiento a soporte humano y monitorear errores con </w:t>
+            </w:r>
+            <w:proofErr w:type="spellStart"/>
+            <w:r>
+              <w:rPr>
+                <w:sz w:val="16"/>
+              </w:rPr>
+              <w:t>Application</w:t>
+            </w:r>
+            <w:proofErr w:type="spellEnd"/>
+            <w:r>
+              <w:rPr>
+                <w:sz w:val="16"/>
+              </w:rPr>
+              <w:t xml:space="preserve"> </w:t>
+            </w:r>
+            <w:proofErr w:type="spellStart"/>
+            <w:r>
+              <w:rPr>
+                <w:sz w:val="16"/>
+              </w:rPr>
+              <w:t>Insights</w:t>
+            </w:r>
+            <w:proofErr w:type="spellEnd"/>
+            <w:r>
+              <w:rPr>
+                <w:sz w:val="16"/>
+              </w:rPr>
+              <w:t>.</w:t>
             </w:r>
           </w:p>
         </w:tc>
@@ -1729,7 +2754,55 @@
                 <w:b/>
                 <w:sz w:val="16"/>
               </w:rPr>
-              <w:t>Pregunta 05: ¿Que metricas deben monitorearse para asegurar el exito del chatbot y como se pueden optimizar sus funcionalidades?</w:t>
+              <w:t xml:space="preserve">Pregunta 05: ¿Que </w:t>
+            </w:r>
+            <w:proofErr w:type="spellStart"/>
+            <w:r>
+              <w:rPr>
+                <w:b/>
+                <w:sz w:val="16"/>
+              </w:rPr>
+              <w:t>metricas</w:t>
+            </w:r>
+            <w:proofErr w:type="spellEnd"/>
+            <w:r>
+              <w:rPr>
+                <w:b/>
+                <w:sz w:val="16"/>
+              </w:rPr>
+              <w:t xml:space="preserve"> deben monitorearse para asegurar el </w:t>
+            </w:r>
+            <w:proofErr w:type="spellStart"/>
+            <w:r>
+              <w:rPr>
+                <w:b/>
+                <w:sz w:val="16"/>
+              </w:rPr>
+              <w:t>exito</w:t>
+            </w:r>
+            <w:proofErr w:type="spellEnd"/>
+            <w:r>
+              <w:rPr>
+                <w:b/>
+                <w:sz w:val="16"/>
+              </w:rPr>
+              <w:t xml:space="preserve"> del </w:t>
+            </w:r>
+            <w:proofErr w:type="spellStart"/>
+            <w:r>
+              <w:rPr>
+                <w:b/>
+                <w:sz w:val="16"/>
+              </w:rPr>
+              <w:t>chatbot</w:t>
+            </w:r>
+            <w:proofErr w:type="spellEnd"/>
+            <w:r>
+              <w:rPr>
+                <w:b/>
+                <w:sz w:val="16"/>
+              </w:rPr>
+              <w:t xml:space="preserve"> y como se pueden optimizar sus funcionalidades?</w:t>
             </w:r>
           </w:p>
         </w:tc>
@@ -1772,13 +2845,105 @@
               <w:rPr>
                 <w:sz w:val="16"/>
               </w:rPr>
-              <w:t xml:space="preserve">Deben monitorearse sesiones iniciadas, intenciones mas </w:t>
-            </w:r>
-            <w:r>
-              <w:rPr>
-                <w:sz w:val="16"/>
-              </w:rPr>
-              <w:t>consultadas, tasa de resolucion, preguntas sin respuesta, tiempo medio de respuesta, CSAT, escalamiento, errores tecnicos, conversion asistida, abandono de carrito y ventas atribuidas. La optimizacion se realiza revisando transcripciones, creando nuevos temas para preguntas recurrentes, mejorando la base de conocimiento, ajustando mensajes de recomendacion, probando variantes de flujos y priorizando las intenciones con mayor impacto en conversion.</w:t>
+              <w:t xml:space="preserve">Deben monitorearse sesiones iniciadas, intenciones </w:t>
+            </w:r>
+            <w:proofErr w:type="spellStart"/>
+            <w:r>
+              <w:rPr>
+                <w:sz w:val="16"/>
+              </w:rPr>
+              <w:t>mas</w:t>
+            </w:r>
+            <w:proofErr w:type="spellEnd"/>
+            <w:r>
+              <w:rPr>
+                <w:sz w:val="16"/>
+              </w:rPr>
+              <w:t xml:space="preserve"> consultadas, tasa de </w:t>
+            </w:r>
+            <w:proofErr w:type="spellStart"/>
+            <w:r>
+              <w:rPr>
+                <w:sz w:val="16"/>
+              </w:rPr>
+              <w:t>resolucion</w:t>
+            </w:r>
+            <w:proofErr w:type="spellEnd"/>
+            <w:r>
+              <w:rPr>
+                <w:sz w:val="16"/>
+              </w:rPr>
+              <w:t xml:space="preserve">, preguntas sin respuesta, tiempo medio de respuesta, CSAT, escalamiento, errores </w:t>
+            </w:r>
+            <w:proofErr w:type="spellStart"/>
+            <w:r>
+              <w:rPr>
+                <w:sz w:val="16"/>
+              </w:rPr>
+              <w:t>tecnicos</w:t>
+            </w:r>
+            <w:proofErr w:type="spellEnd"/>
+            <w:r>
+              <w:rPr>
+                <w:sz w:val="16"/>
+              </w:rPr>
+              <w:t xml:space="preserve">, </w:t>
+            </w:r>
+            <w:proofErr w:type="spellStart"/>
+            <w:r>
+              <w:rPr>
+                <w:sz w:val="16"/>
+              </w:rPr>
+              <w:t>conversion</w:t>
+            </w:r>
+            <w:proofErr w:type="spellEnd"/>
+            <w:r>
+              <w:rPr>
+                <w:sz w:val="16"/>
+              </w:rPr>
+              <w:t xml:space="preserve"> asistida, abandono de carrito y ventas atribuidas. La </w:t>
+            </w:r>
+            <w:proofErr w:type="spellStart"/>
+            <w:r>
+              <w:rPr>
+                <w:sz w:val="16"/>
+              </w:rPr>
+              <w:t>optimizacion</w:t>
+            </w:r>
+            <w:proofErr w:type="spellEnd"/>
+            <w:r>
+              <w:rPr>
+                <w:sz w:val="16"/>
+              </w:rPr>
+              <w:t xml:space="preserve"> se realiza revisando transcripciones, creando nuevos temas para preguntas recurrentes, mejorando la base de conocimiento, ajustando mensajes de </w:t>
+            </w:r>
+            <w:proofErr w:type="spellStart"/>
+            <w:r>
+              <w:rPr>
+                <w:sz w:val="16"/>
+              </w:rPr>
+              <w:t>recomendacion</w:t>
+            </w:r>
+            <w:proofErr w:type="spellEnd"/>
+            <w:r>
+              <w:rPr>
+                <w:sz w:val="16"/>
+              </w:rPr>
+              <w:t xml:space="preserve">, probando variantes de flujos y priorizando las intenciones con mayor impacto en </w:t>
+            </w:r>
+            <w:proofErr w:type="spellStart"/>
+            <w:r>
+              <w:rPr>
+                <w:sz w:val="16"/>
+              </w:rPr>
+              <w:t>conversion</w:t>
+            </w:r>
+            <w:proofErr w:type="spellEnd"/>
+            <w:r>
+              <w:rPr>
+                <w:sz w:val="16"/>
+              </w:rPr>
+              <w:t>.</w:t>
             </w:r>
           </w:p>
         </w:tc>
@@ -1846,6 +3011,7 @@
           <w:noProof/>
           <w:sz w:val="20"/>
         </w:rPr>
+        <w:lastRenderedPageBreak/>
         <mc:AlternateContent>
           <mc:Choice Requires="wps">
             <w:drawing>
@@ -2324,11 +3490,19 @@
             <w:vAlign w:val="center"/>
           </w:tcPr>
           <w:p>
-            <w:r>
-              <w:rPr>
-                <w:sz w:val="16"/>
-              </w:rPr>
-              <w:t>Analisis del caso y preguntas frecuentes</w:t>
+            <w:proofErr w:type="spellStart"/>
+            <w:r>
+              <w:rPr>
+                <w:sz w:val="16"/>
+              </w:rPr>
+              <w:t>Analisis</w:t>
+            </w:r>
+            <w:proofErr w:type="spellEnd"/>
+            <w:r>
+              <w:rPr>
+                <w:sz w:val="16"/>
+              </w:rPr>
+              <w:t xml:space="preserve"> del caso y preguntas frecuentes</w:t>
             </w:r>
           </w:p>
         </w:tc>
@@ -2407,11 +3581,19 @@
             <w:vAlign w:val="center"/>
           </w:tcPr>
           <w:p>
-            <w:r>
-              <w:rPr>
-                <w:sz w:val="16"/>
-              </w:rPr>
-              <w:t>Diseno de flujos conversacionales</w:t>
+            <w:proofErr w:type="spellStart"/>
+            <w:r>
+              <w:rPr>
+                <w:sz w:val="16"/>
+              </w:rPr>
+              <w:t>Diseno</w:t>
+            </w:r>
+            <w:proofErr w:type="spellEnd"/>
+            <w:r>
+              <w:rPr>
+                <w:sz w:val="16"/>
+              </w:rPr>
+              <w:t xml:space="preserve"> de flujos conversacionales</w:t>
             </w:r>
           </w:p>
         </w:tc>
@@ -2490,17 +3672,33 @@
             <w:vAlign w:val="center"/>
           </w:tcPr>
           <w:p>
-            <w:r>
-              <w:rPr>
-                <w:sz w:val="16"/>
-              </w:rPr>
-              <w:t xml:space="preserve">Seleccion y configuracion de plataforma </w:t>
-            </w:r>
-            <w:r>
-              <w:rPr>
-                <w:sz w:val="16"/>
-              </w:rPr>
-              <w:t>Azure</w:t>
+            <w:proofErr w:type="spellStart"/>
+            <w:r>
+              <w:rPr>
+                <w:sz w:val="16"/>
+              </w:rPr>
+              <w:t>Seleccion</w:t>
+            </w:r>
+            <w:proofErr w:type="spellEnd"/>
+            <w:r>
+              <w:rPr>
+                <w:sz w:val="16"/>
+              </w:rPr>
+              <w:t xml:space="preserve"> y </w:t>
+            </w:r>
+            <w:proofErr w:type="spellStart"/>
+            <w:r>
+              <w:rPr>
+                <w:sz w:val="16"/>
+              </w:rPr>
+              <w:t>configuracion</w:t>
+            </w:r>
+            <w:proofErr w:type="spellEnd"/>
+            <w:r>
+              <w:rPr>
+                <w:sz w:val="16"/>
+              </w:rPr>
+              <w:t xml:space="preserve"> de plataforma Azure</w:t>
             </w:r>
           </w:p>
         </w:tc>
@@ -2587,11 +3785,19 @@
             <w:vAlign w:val="center"/>
           </w:tcPr>
           <w:p>
-            <w:r>
-              <w:rPr>
-                <w:sz w:val="16"/>
-              </w:rPr>
-              <w:t>Construccion de temas, FAQ e integraciones</w:t>
+            <w:proofErr w:type="spellStart"/>
+            <w:r>
+              <w:rPr>
+                <w:sz w:val="16"/>
+              </w:rPr>
+              <w:t>Construccion</w:t>
+            </w:r>
+            <w:proofErr w:type="spellEnd"/>
+            <w:r>
+              <w:rPr>
+                <w:sz w:val="16"/>
+              </w:rPr>
+              <w:t xml:space="preserve"> de temas, FAQ e integraciones</w:t>
             </w:r>
           </w:p>
         </w:tc>
@@ -2682,8 +3888,16 @@
               <w:rPr>
                 <w:sz w:val="16"/>
               </w:rPr>
-              <w:t>Pruebas funcionales, seguridad y metricas</w:t>
-            </w:r>
+              <w:t xml:space="preserve">Pruebas funcionales, seguridad y </w:t>
+            </w:r>
+            <w:proofErr w:type="spellStart"/>
+            <w:r>
+              <w:rPr>
+                <w:sz w:val="16"/>
+              </w:rPr>
+              <w:t>metricas</w:t>
+            </w:r>
+            <w:proofErr w:type="spellEnd"/>
           </w:p>
         </w:tc>
         <w:tc>
@@ -2773,7 +3987,21 @@
               <w:rPr>
                 <w:sz w:val="16"/>
               </w:rPr>
-              <w:t>Piloto, optimizacion y entrega final</w:t>
+              <w:t xml:space="preserve">Piloto, </w:t>
+            </w:r>
+            <w:proofErr w:type="spellStart"/>
+            <w:r>
+              <w:rPr>
+                <w:sz w:val="16"/>
+              </w:rPr>
+              <w:t>optimizacion</w:t>
+            </w:r>
+            <w:proofErr w:type="spellEnd"/>
+            <w:r>
+              <w:rPr>
+                <w:sz w:val="16"/>
+              </w:rPr>
+              <w:t xml:space="preserve"> y entrega final</w:t>
             </w:r>
           </w:p>
         </w:tc>
@@ -2974,6 +4202,123 @@
               <w:t>MÁQUINAS Y EQUIPOS</w:t>
             </w:r>
           </w:p>
+          <w:p>
+            <w:pPr>
+              <w:rPr>
+                <w:rFonts w:ascii="Arial" w:hAnsi="Arial" w:cs="Arial"/>
+                <w:b/>
+                <w:szCs w:val="20"/>
+              </w:rPr>
+            </w:pPr>
+          </w:p>
+          <w:p>
+            <w:pPr>
+              <w:rPr>
+                <w:rFonts w:ascii="Arial" w:hAnsi="Arial" w:cs="Arial"/>
+                <w:b/>
+                <w:szCs w:val="20"/>
+              </w:rPr>
+            </w:pPr>
+          </w:p>
+          <w:p>
+            <w:pPr>
+              <w:rPr>
+                <w:rFonts w:ascii="Arial" w:hAnsi="Arial" w:cs="Arial"/>
+                <w:b/>
+                <w:szCs w:val="20"/>
+              </w:rPr>
+            </w:pPr>
+          </w:p>
+          <w:p>
+            <w:pPr>
+              <w:rPr>
+                <w:rFonts w:ascii="Arial" w:hAnsi="Arial" w:cs="Arial"/>
+                <w:b/>
+                <w:szCs w:val="20"/>
+              </w:rPr>
+            </w:pPr>
+          </w:p>
+          <w:p>
+            <w:pPr>
+              <w:rPr>
+                <w:rFonts w:ascii="Arial" w:hAnsi="Arial" w:cs="Arial"/>
+                <w:b/>
+                <w:szCs w:val="20"/>
+              </w:rPr>
+            </w:pPr>
+          </w:p>
+          <w:p>
+            <w:pPr>
+              <w:rPr>
+                <w:rFonts w:ascii="Arial" w:hAnsi="Arial" w:cs="Arial"/>
+                <w:b/>
+                <w:szCs w:val="20"/>
+              </w:rPr>
+            </w:pPr>
+          </w:p>
+          <w:p>
+            <w:pPr>
+              <w:rPr>
+                <w:rFonts w:ascii="Arial" w:hAnsi="Arial" w:cs="Arial"/>
+                <w:b/>
+                <w:szCs w:val="20"/>
+              </w:rPr>
+            </w:pPr>
+          </w:p>
+          <w:p>
+            <w:pPr>
+              <w:rPr>
+                <w:rFonts w:ascii="Arial" w:hAnsi="Arial" w:cs="Arial"/>
+                <w:b/>
+                <w:szCs w:val="20"/>
+              </w:rPr>
+            </w:pPr>
+          </w:p>
+          <w:p>
+            <w:pPr>
+              <w:rPr>
+                <w:rFonts w:ascii="Arial" w:hAnsi="Arial" w:cs="Arial"/>
+                <w:b/>
+                <w:szCs w:val="20"/>
+              </w:rPr>
+            </w:pPr>
+          </w:p>
+          <w:p>
+            <w:pPr>
+              <w:rPr>
+                <w:rFonts w:ascii="Arial" w:hAnsi="Arial" w:cs="Arial"/>
+                <w:b/>
+                <w:szCs w:val="20"/>
+              </w:rPr>
+            </w:pPr>
+          </w:p>
+          <w:p>
+            <w:pPr>
+              <w:rPr>
+                <w:rFonts w:ascii="Arial" w:hAnsi="Arial" w:cs="Arial"/>
+                <w:b/>
+                <w:szCs w:val="20"/>
+              </w:rPr>
+            </w:pPr>
+          </w:p>
+          <w:p>
+            <w:pPr>
+              <w:rPr>
+                <w:rFonts w:ascii="Arial" w:hAnsi="Arial" w:cs="Arial"/>
+                <w:b/>
+                <w:szCs w:val="20"/>
+              </w:rPr>
+            </w:pPr>
+          </w:p>
+          <w:p>
+            <w:pPr>
+              <w:rPr>
+                <w:rFonts w:ascii="Arial" w:hAnsi="Arial" w:cs="Arial"/>
+                <w:b/>
+                <w:szCs w:val="20"/>
+              </w:rPr>
+            </w:pPr>
+          </w:p>
         </w:tc>
       </w:tr>
       <w:tr>
@@ -3055,7 +4400,21 @@
               <w:rPr>
                 <w:sz w:val="16"/>
               </w:rPr>
-              <w:t>Computadora portatil o PC</w:t>
+              <w:t xml:space="preserve">Computadora </w:t>
+            </w:r>
+            <w:proofErr w:type="spellStart"/>
+            <w:r>
+              <w:rPr>
+                <w:sz w:val="16"/>
+              </w:rPr>
+              <w:t>portatil</w:t>
+            </w:r>
+            <w:proofErr w:type="spellEnd"/>
+            <w:r>
+              <w:rPr>
+                <w:sz w:val="16"/>
+              </w:rPr>
+              <w:t xml:space="preserve"> o PC</w:t>
             </w:r>
           </w:p>
         </w:tc>
@@ -3093,11 +4452,19 @@
             <w:vAlign w:val="center"/>
           </w:tcPr>
           <w:p>
-            <w:r>
-              <w:rPr>
-                <w:sz w:val="16"/>
-              </w:rPr>
-              <w:t>Conexion a Internet</w:t>
+            <w:proofErr w:type="spellStart"/>
+            <w:r>
+              <w:rPr>
+                <w:sz w:val="16"/>
+              </w:rPr>
+              <w:t>Conexion</w:t>
+            </w:r>
+            <w:proofErr w:type="spellEnd"/>
+            <w:r>
+              <w:rPr>
+                <w:sz w:val="16"/>
+              </w:rPr>
+              <w:t xml:space="preserve"> a Internet</w:t>
             </w:r>
           </w:p>
         </w:tc>
@@ -3355,7 +4722,21 @@
               <w:rPr>
                 <w:sz w:val="16"/>
               </w:rPr>
-              <w:t>Microsoft Copilot Studio</w:t>
+              <w:t xml:space="preserve">Microsoft </w:t>
+            </w:r>
+            <w:proofErr w:type="spellStart"/>
+            <w:r>
+              <w:rPr>
+                <w:sz w:val="16"/>
+              </w:rPr>
+              <w:t>Copilot</w:t>
+            </w:r>
+            <w:proofErr w:type="spellEnd"/>
+            <w:r>
+              <w:rPr>
+                <w:sz w:val="16"/>
+              </w:rPr>
+              <w:t xml:space="preserve"> Studio</w:t>
             </w:r>
           </w:p>
         </w:tc>
@@ -3397,8 +4778,16 @@
               <w:rPr>
                 <w:sz w:val="16"/>
               </w:rPr>
-              <w:t>Azure AI Bot Service</w:t>
-            </w:r>
+              <w:t xml:space="preserve">Azure AI Bot </w:t>
+            </w:r>
+            <w:proofErr w:type="spellStart"/>
+            <w:r>
+              <w:rPr>
+                <w:sz w:val="16"/>
+              </w:rPr>
+              <w:t>Service</w:t>
+            </w:r>
+            <w:proofErr w:type="spellEnd"/>
           </w:p>
         </w:tc>
         <w:tc>
@@ -3435,17 +4824,17 @@
             <w:vAlign w:val="center"/>
           </w:tcPr>
           <w:p>
-            <w:r>
-              <w:rPr>
-                <w:sz w:val="16"/>
-              </w:rPr>
-              <w:t xml:space="preserve">Bot Framework Web Chat / Direct </w:t>
-            </w:r>
-            <w:r>
-              <w:rPr>
-                <w:sz w:val="16"/>
-              </w:rPr>
-              <w:t>Line</w:t>
+            <w:pPr>
+              <w:rPr>
+                <w:lang w:val="en-US"/>
+              </w:rPr>
+            </w:pPr>
+            <w:r>
+              <w:rPr>
+                <w:sz w:val="16"/>
+                <w:lang w:val="en-US"/>
+              </w:rPr>
+              <w:t>Bot Framework Web Chat / Direct Line</w:t>
             </w:r>
           </w:p>
         </w:tc>
@@ -3483,11 +4872,33 @@
             <w:vAlign w:val="center"/>
           </w:tcPr>
           <w:p>
-            <w:r>
-              <w:rPr>
-                <w:sz w:val="16"/>
-              </w:rPr>
-              <w:t>Application Insights / Azure Monitor</w:t>
+            <w:proofErr w:type="spellStart"/>
+            <w:r>
+              <w:rPr>
+                <w:sz w:val="16"/>
+              </w:rPr>
+              <w:t>Application</w:t>
+            </w:r>
+            <w:proofErr w:type="spellEnd"/>
+            <w:r>
+              <w:rPr>
+                <w:sz w:val="16"/>
+              </w:rPr>
+              <w:t xml:space="preserve"> </w:t>
+            </w:r>
+            <w:proofErr w:type="spellStart"/>
+            <w:r>
+              <w:rPr>
+                <w:sz w:val="16"/>
+              </w:rPr>
+              <w:t>Insights</w:t>
+            </w:r>
+            <w:proofErr w:type="spellEnd"/>
+            <w:r>
+              <w:rPr>
+                <w:sz w:val="16"/>
+              </w:rPr>
+              <w:t xml:space="preserve"> / Azure Monitor</w:t>
             </w:r>
           </w:p>
         </w:tc>
@@ -3668,11 +5079,19 @@
             <w:vAlign w:val="center"/>
           </w:tcPr>
           <w:p>
-            <w:r>
-              <w:rPr>
-                <w:sz w:val="16"/>
-              </w:rPr>
-              <w:t>Catalogo de productos</w:t>
+            <w:proofErr w:type="spellStart"/>
+            <w:r>
+              <w:rPr>
+                <w:sz w:val="16"/>
+              </w:rPr>
+              <w:t>Catalogo</w:t>
+            </w:r>
+            <w:proofErr w:type="spellEnd"/>
+            <w:r>
+              <w:rPr>
+                <w:sz w:val="16"/>
+              </w:rPr>
+              <w:t xml:space="preserve"> de productos</w:t>
             </w:r>
           </w:p>
         </w:tc>
@@ -3752,12 +5171,42 @@
             <w:vAlign w:val="center"/>
           </w:tcPr>
           <w:p>
-            <w:r>
-              <w:rPr>
-                <w:sz w:val="16"/>
-              </w:rPr>
-              <w:t>Politicas de pago, envio y garantia</w:t>
-            </w:r>
+            <w:proofErr w:type="spellStart"/>
+            <w:r>
+              <w:rPr>
+                <w:sz w:val="16"/>
+              </w:rPr>
+              <w:t>Politicas</w:t>
+            </w:r>
+            <w:proofErr w:type="spellEnd"/>
+            <w:r>
+              <w:rPr>
+                <w:sz w:val="16"/>
+              </w:rPr>
+              <w:t xml:space="preserve"> de pago, </w:t>
+            </w:r>
+            <w:proofErr w:type="spellStart"/>
+            <w:r>
+              <w:rPr>
+                <w:sz w:val="16"/>
+              </w:rPr>
+              <w:t>envio</w:t>
+            </w:r>
+            <w:proofErr w:type="spellEnd"/>
+            <w:r>
+              <w:rPr>
+                <w:sz w:val="16"/>
+              </w:rPr>
+              <w:t xml:space="preserve"> y </w:t>
+            </w:r>
+            <w:proofErr w:type="spellStart"/>
+            <w:r>
+              <w:rPr>
+                <w:sz w:val="16"/>
+              </w:rPr>
+              <w:t>garantia</w:t>
+            </w:r>
+            <w:proofErr w:type="spellEnd"/>
           </w:p>
         </w:tc>
         <w:tc>
@@ -3814,11 +5263,19 @@
             <w:vAlign w:val="center"/>
           </w:tcPr>
           <w:p>
-            <w:r>
-              <w:rPr>
-                <w:sz w:val="16"/>
-              </w:rPr>
-              <w:t>Segun disponibilidad</w:t>
+            <w:proofErr w:type="spellStart"/>
+            <w:r>
+              <w:rPr>
+                <w:sz w:val="16"/>
+              </w:rPr>
+              <w:t>Segun</w:t>
+            </w:r>
+            <w:proofErr w:type="spellEnd"/>
+            <w:r>
+              <w:rPr>
+                <w:sz w:val="16"/>
+              </w:rPr>
+              <w:t xml:space="preserve"> disponibilidad</w:t>
             </w:r>
           </w:p>
         </w:tc>
@@ -3859,6 +5316,7 @@
           <w:noProof/>
           <w:sz w:val="20"/>
         </w:rPr>
+        <w:lastRenderedPageBreak/>
         <mc:AlternateContent>
           <mc:Choice Requires="wps">
             <w:drawing>
@@ -4186,8 +5644,30 @@
               <w:rPr>
                 <w:b/>
               </w:rPr>
-              <w:t>Propuesta tecnica para InnovVentas</w:t>
-            </w:r>
+              <w:t xml:space="preserve">Propuesta </w:t>
+            </w:r>
+            <w:proofErr w:type="spellStart"/>
+            <w:r>
+              <w:rPr>
+                <w:b/>
+              </w:rPr>
+              <w:t>tecnica</w:t>
+            </w:r>
+            <w:proofErr w:type="spellEnd"/>
+            <w:r>
+              <w:rPr>
+                <w:b/>
+              </w:rPr>
+              <w:t xml:space="preserve"> para </w:t>
+            </w:r>
+            <w:proofErr w:type="spellStart"/>
+            <w:r>
+              <w:rPr>
+                <w:b/>
+              </w:rPr>
+              <w:t>InnovVentas</w:t>
+            </w:r>
+            <w:proofErr w:type="spellEnd"/>
           </w:p>
           <w:p>
             <w:pPr>
@@ -4205,17 +5685,75 @@
             <w:pPr>
               <w:spacing w:after="60"/>
             </w:pPr>
-            <w:r>
-              <w:rPr>
-                <w:sz w:val="16"/>
-              </w:rPr>
-              <w:t xml:space="preserve">InnovVentas pierde oportunidades de venta porque el </w:t>
-            </w:r>
-            <w:r>
-              <w:rPr>
-                <w:sz w:val="16"/>
-              </w:rPr>
-              <w:t>sitio web no responde de forma inmediata dudas que aparecen durante la decision de compra. El problema afecta tres puntos del flujo e-commerce: exploracion de productos, confirmacion de condiciones de compra y soporte posterior.</w:t>
+            <w:proofErr w:type="spellStart"/>
+            <w:r>
+              <w:rPr>
+                <w:sz w:val="16"/>
+              </w:rPr>
+              <w:t>InnovVentas</w:t>
+            </w:r>
+            <w:proofErr w:type="spellEnd"/>
+            <w:r>
+              <w:rPr>
+                <w:sz w:val="16"/>
+              </w:rPr>
+              <w:t xml:space="preserve"> pierde oportunidades de venta porque el sitio web no responde de forma inmediata dudas que aparecen durante la </w:t>
+            </w:r>
+            <w:proofErr w:type="spellStart"/>
+            <w:r>
+              <w:rPr>
+                <w:sz w:val="16"/>
+              </w:rPr>
+              <w:t>decision</w:t>
+            </w:r>
+            <w:proofErr w:type="spellEnd"/>
+            <w:r>
+              <w:rPr>
+                <w:sz w:val="16"/>
+              </w:rPr>
+              <w:t xml:space="preserve"> de compra. El problema afecta tres puntos del flujo e-</w:t>
+            </w:r>
+            <w:proofErr w:type="spellStart"/>
+            <w:r>
+              <w:rPr>
+                <w:sz w:val="16"/>
+              </w:rPr>
+              <w:t>commerce</w:t>
+            </w:r>
+            <w:proofErr w:type="spellEnd"/>
+            <w:r>
+              <w:rPr>
+                <w:sz w:val="16"/>
+              </w:rPr>
+              <w:t xml:space="preserve">: </w:t>
+            </w:r>
+            <w:proofErr w:type="spellStart"/>
+            <w:r>
+              <w:rPr>
+                <w:sz w:val="16"/>
+              </w:rPr>
+              <w:t>exploracion</w:t>
+            </w:r>
+            <w:proofErr w:type="spellEnd"/>
+            <w:r>
+              <w:rPr>
+                <w:sz w:val="16"/>
+              </w:rPr>
+              <w:t xml:space="preserve"> de productos, </w:t>
+            </w:r>
+            <w:proofErr w:type="spellStart"/>
+            <w:r>
+              <w:rPr>
+                <w:sz w:val="16"/>
+              </w:rPr>
+              <w:t>confirmacion</w:t>
+            </w:r>
+            <w:proofErr w:type="spellEnd"/>
+            <w:r>
+              <w:rPr>
+                <w:sz w:val="16"/>
+              </w:rPr>
+              <w:t xml:space="preserve"> de condiciones de compra y soporte posterior.</w:t>
             </w:r>
           </w:p>
           <w:p>
@@ -4226,7 +5764,63 @@
               <w:rPr>
                 <w:sz w:val="16"/>
               </w:rPr>
-              <w:t>La propuesta consiste en implementar un chatbot integrado al sitio web, disponible 24/7, capaz de resolver preguntas frecuentes, guiar la seleccion de productos, reducir friccion en checkout y derivar a soporte humano cuando la consulta supere el alcance automatizado.</w:t>
+              <w:t xml:space="preserve">La propuesta consiste en implementar un </w:t>
+            </w:r>
+            <w:proofErr w:type="spellStart"/>
+            <w:r>
+              <w:rPr>
+                <w:sz w:val="16"/>
+              </w:rPr>
+              <w:t>chatbot</w:t>
+            </w:r>
+            <w:proofErr w:type="spellEnd"/>
+            <w:r>
+              <w:rPr>
+                <w:sz w:val="16"/>
+              </w:rPr>
+              <w:t xml:space="preserve"> integrado al sitio web, disponible 24/7, capaz de resolver preguntas frecuentes, guiar la </w:t>
+            </w:r>
+            <w:proofErr w:type="spellStart"/>
+            <w:r>
+              <w:rPr>
+                <w:sz w:val="16"/>
+              </w:rPr>
+              <w:t>seleccion</w:t>
+            </w:r>
+            <w:proofErr w:type="spellEnd"/>
+            <w:r>
+              <w:rPr>
+                <w:sz w:val="16"/>
+              </w:rPr>
+              <w:t xml:space="preserve"> de productos, reducir </w:t>
+            </w:r>
+            <w:proofErr w:type="spellStart"/>
+            <w:r>
+              <w:rPr>
+                <w:sz w:val="16"/>
+              </w:rPr>
+              <w:t>friccion</w:t>
+            </w:r>
+            <w:proofErr w:type="spellEnd"/>
+            <w:r>
+              <w:rPr>
+                <w:sz w:val="16"/>
+              </w:rPr>
+              <w:t xml:space="preserve"> en </w:t>
+            </w:r>
+            <w:proofErr w:type="spellStart"/>
+            <w:r>
+              <w:rPr>
+                <w:sz w:val="16"/>
+              </w:rPr>
+              <w:t>checkout</w:t>
+            </w:r>
+            <w:proofErr w:type="spellEnd"/>
+            <w:r>
+              <w:rPr>
+                <w:sz w:val="16"/>
+              </w:rPr>
+              <w:t xml:space="preserve"> y derivar a soporte humano cuando la consulta supere el alcance automatizado.</w:t>
             </w:r>
           </w:p>
           <w:p>
@@ -4238,18 +5832,63 @@
                 <w:b/>
                 <w:sz w:val="20"/>
               </w:rPr>
-              <w:t>2. Alcance funcional del chatbot</w:t>
-            </w:r>
+              <w:t xml:space="preserve">2. Alcance funcional del </w:t>
+            </w:r>
+            <w:proofErr w:type="spellStart"/>
+            <w:r>
+              <w:rPr>
+                <w:b/>
+                <w:sz w:val="20"/>
+              </w:rPr>
+              <w:t>chatbot</w:t>
+            </w:r>
+            <w:proofErr w:type="spellEnd"/>
           </w:p>
           <w:p>
             <w:pPr>
               <w:spacing w:after="60"/>
             </w:pPr>
-            <w:r>
-              <w:rPr>
-                <w:sz w:val="16"/>
-              </w:rPr>
-              <w:t>Atendera preguntas frecuentes sobre stock, especificaciones, pagos, envios, garantias y devoluciones.</w:t>
+            <w:proofErr w:type="spellStart"/>
+            <w:r>
+              <w:rPr>
+                <w:sz w:val="16"/>
+              </w:rPr>
+              <w:t>Atendera</w:t>
+            </w:r>
+            <w:proofErr w:type="spellEnd"/>
+            <w:r>
+              <w:rPr>
+                <w:sz w:val="16"/>
+              </w:rPr>
+              <w:t xml:space="preserve"> preguntas frecuentes sobre stock, especificaciones, pagos, </w:t>
+            </w:r>
+            <w:proofErr w:type="spellStart"/>
+            <w:r>
+              <w:rPr>
+                <w:sz w:val="16"/>
+              </w:rPr>
+              <w:t>envios</w:t>
+            </w:r>
+            <w:proofErr w:type="spellEnd"/>
+            <w:r>
+              <w:rPr>
+                <w:sz w:val="16"/>
+              </w:rPr>
+              <w:t xml:space="preserve">, </w:t>
+            </w:r>
+            <w:proofErr w:type="spellStart"/>
+            <w:r>
+              <w:rPr>
+                <w:sz w:val="16"/>
+              </w:rPr>
+              <w:t>garantias</w:t>
+            </w:r>
+            <w:proofErr w:type="spellEnd"/>
+            <w:r>
+              <w:rPr>
+                <w:sz w:val="16"/>
+              </w:rPr>
+              <w:t xml:space="preserve"> y devoluciones.</w:t>
             </w:r>
           </w:p>
           <w:p>
@@ -4260,29 +5899,129 @@
               <w:rPr>
                 <w:sz w:val="16"/>
               </w:rPr>
-              <w:t>Recomendara productos segun categoria, presupuesto, uso previsto y caracteristicas relevantes.</w:t>
+              <w:t xml:space="preserve">Recomendara productos </w:t>
+            </w:r>
+            <w:proofErr w:type="spellStart"/>
+            <w:r>
+              <w:rPr>
+                <w:sz w:val="16"/>
+              </w:rPr>
+              <w:t>segun</w:t>
+            </w:r>
+            <w:proofErr w:type="spellEnd"/>
+            <w:r>
+              <w:rPr>
+                <w:sz w:val="16"/>
+              </w:rPr>
+              <w:t xml:space="preserve"> </w:t>
+            </w:r>
+            <w:proofErr w:type="spellStart"/>
+            <w:r>
+              <w:rPr>
+                <w:sz w:val="16"/>
+              </w:rPr>
+              <w:t>categoria</w:t>
+            </w:r>
+            <w:proofErr w:type="spellEnd"/>
+            <w:r>
+              <w:rPr>
+                <w:sz w:val="16"/>
+              </w:rPr>
+              <w:t xml:space="preserve">, presupuesto, uso previsto y </w:t>
+            </w:r>
+            <w:proofErr w:type="spellStart"/>
+            <w:r>
+              <w:rPr>
+                <w:sz w:val="16"/>
+              </w:rPr>
+              <w:t>caracteristicas</w:t>
+            </w:r>
+            <w:proofErr w:type="spellEnd"/>
+            <w:r>
+              <w:rPr>
+                <w:sz w:val="16"/>
+              </w:rPr>
+              <w:t xml:space="preserve"> relevantes.</w:t>
             </w:r>
           </w:p>
           <w:p>
             <w:pPr>
               <w:spacing w:after="60"/>
             </w:pPr>
-            <w:r>
-              <w:rPr>
-                <w:sz w:val="16"/>
-              </w:rPr>
-              <w:t>Acompanara el proceso de compra con enlaces a producto, carrito, medios de pago y seguimiento de pedido.</w:t>
+            <w:proofErr w:type="spellStart"/>
+            <w:r>
+              <w:rPr>
+                <w:sz w:val="16"/>
+              </w:rPr>
+              <w:t>Acompanara</w:t>
+            </w:r>
+            <w:proofErr w:type="spellEnd"/>
+            <w:r>
+              <w:rPr>
+                <w:sz w:val="16"/>
+              </w:rPr>
+              <w:t xml:space="preserve"> el proceso de compra con enlaces a producto, carrito, medios de pago y seguimiento de pedido.</w:t>
             </w:r>
           </w:p>
           <w:p>
             <w:pPr>
               <w:spacing w:after="60"/>
             </w:pPr>
-            <w:r>
-              <w:rPr>
-                <w:sz w:val="16"/>
-              </w:rPr>
-              <w:t>Ofrecera soporte tecnico basico y escalara a un asesor cuando detecte reclamos, fallas complejas o baja satisfaccion.</w:t>
+            <w:proofErr w:type="spellStart"/>
+            <w:r>
+              <w:rPr>
+                <w:sz w:val="16"/>
+              </w:rPr>
+              <w:t>Ofrecera</w:t>
+            </w:r>
+            <w:proofErr w:type="spellEnd"/>
+            <w:r>
+              <w:rPr>
+                <w:sz w:val="16"/>
+              </w:rPr>
+              <w:t xml:space="preserve"> soporte </w:t>
+            </w:r>
+            <w:proofErr w:type="spellStart"/>
+            <w:r>
+              <w:rPr>
+                <w:sz w:val="16"/>
+              </w:rPr>
+              <w:t>tecnico</w:t>
+            </w:r>
+            <w:proofErr w:type="spellEnd"/>
+            <w:r>
+              <w:rPr>
+                <w:sz w:val="16"/>
+              </w:rPr>
+              <w:t xml:space="preserve"> </w:t>
+            </w:r>
+            <w:proofErr w:type="spellStart"/>
+            <w:r>
+              <w:rPr>
+                <w:sz w:val="16"/>
+              </w:rPr>
+              <w:t>basico</w:t>
+            </w:r>
+            <w:proofErr w:type="spellEnd"/>
+            <w:r>
+              <w:rPr>
+                <w:sz w:val="16"/>
+              </w:rPr>
+              <w:t xml:space="preserve"> y escalara a un asesor cuando detecte reclamos, fallas complejas o baja </w:t>
+            </w:r>
+            <w:proofErr w:type="spellStart"/>
+            <w:r>
+              <w:rPr>
+                <w:sz w:val="16"/>
+              </w:rPr>
+              <w:t>satisfaccion</w:t>
+            </w:r>
+            <w:proofErr w:type="spellEnd"/>
+            <w:r>
+              <w:rPr>
+                <w:sz w:val="16"/>
+              </w:rPr>
+              <w:t>.</w:t>
             </w:r>
           </w:p>
           <w:p>
@@ -4305,18 +6044,222 @@
               <w:rPr>
                 <w:sz w:val="16"/>
               </w:rPr>
-              <w:t>Se recomienda Microsoft Copilot Studio como plataforma principal por su enfoque de bajo codigo, capacidad de crear agentes, configurar temas, usar conocimiento corporativo y publicar el agente en canales web. Para un sitio con necesidades de mayor personalizacion visual o control del front-end, se complementa con Azure AI Bot Service, Bot Framework Web Chat y Direct Line.</w:t>
+              <w:t xml:space="preserve">Se recomienda Microsoft </w:t>
+            </w:r>
+            <w:proofErr w:type="spellStart"/>
+            <w:r>
+              <w:rPr>
+                <w:sz w:val="16"/>
+              </w:rPr>
+              <w:t>Copilot</w:t>
+            </w:r>
+            <w:proofErr w:type="spellEnd"/>
+            <w:r>
+              <w:rPr>
+                <w:sz w:val="16"/>
+              </w:rPr>
+              <w:t xml:space="preserve"> Studio como plataforma principal por su enfoque de bajo </w:t>
+            </w:r>
+            <w:proofErr w:type="spellStart"/>
+            <w:r>
+              <w:rPr>
+                <w:sz w:val="16"/>
+              </w:rPr>
+              <w:t>codigo</w:t>
+            </w:r>
+            <w:proofErr w:type="spellEnd"/>
+            <w:r>
+              <w:rPr>
+                <w:sz w:val="16"/>
+              </w:rPr>
+              <w:t xml:space="preserve">, capacidad de crear agentes, configurar temas, usar conocimiento corporativo y publicar el agente en canales web. Para un sitio con necesidades de mayor </w:t>
+            </w:r>
+            <w:proofErr w:type="spellStart"/>
+            <w:r>
+              <w:rPr>
+                <w:sz w:val="16"/>
+              </w:rPr>
+              <w:t>personalizacion</w:t>
+            </w:r>
+            <w:proofErr w:type="spellEnd"/>
+            <w:r>
+              <w:rPr>
+                <w:sz w:val="16"/>
+              </w:rPr>
+              <w:t xml:space="preserve"> visual o control del </w:t>
+            </w:r>
+            <w:proofErr w:type="spellStart"/>
+            <w:r>
+              <w:rPr>
+                <w:sz w:val="16"/>
+              </w:rPr>
+              <w:t>front-end</w:t>
+            </w:r>
+            <w:proofErr w:type="spellEnd"/>
+            <w:r>
+              <w:rPr>
+                <w:sz w:val="16"/>
+              </w:rPr>
+              <w:t xml:space="preserve">, se complementa con Azure AI Bot </w:t>
+            </w:r>
+            <w:proofErr w:type="spellStart"/>
+            <w:r>
+              <w:rPr>
+                <w:sz w:val="16"/>
+              </w:rPr>
+              <w:t>Service</w:t>
+            </w:r>
+            <w:proofErr w:type="spellEnd"/>
+            <w:r>
+              <w:rPr>
+                <w:sz w:val="16"/>
+              </w:rPr>
+              <w:t>, Bot Framework Web Chat y Direct Line.</w:t>
             </w:r>
           </w:p>
           <w:p>
             <w:pPr>
               <w:spacing w:after="60"/>
             </w:pPr>
-            <w:r>
-              <w:rPr>
-                <w:sz w:val="16"/>
-              </w:rPr>
-              <w:t>Application Insights/Azure Monitor se usara para telemetria, diagnostico y analisis de uso. Las fuentes oficiales de Microsoft indican que Web Chat puede integrarse en sitios web mediante JavaScript o React y que Application Insights permite visualizar disponibilidad, rendimiento y uso del bot.</w:t>
+            <w:proofErr w:type="spellStart"/>
+            <w:r>
+              <w:rPr>
+                <w:sz w:val="16"/>
+              </w:rPr>
+              <w:t>Application</w:t>
+            </w:r>
+            <w:proofErr w:type="spellEnd"/>
+            <w:r>
+              <w:rPr>
+                <w:sz w:val="16"/>
+              </w:rPr>
+              <w:t xml:space="preserve"> </w:t>
+            </w:r>
+            <w:proofErr w:type="spellStart"/>
+            <w:r>
+              <w:rPr>
+                <w:sz w:val="16"/>
+              </w:rPr>
+              <w:t>Insights</w:t>
+            </w:r>
+            <w:proofErr w:type="spellEnd"/>
+            <w:r>
+              <w:rPr>
+                <w:sz w:val="16"/>
+              </w:rPr>
+              <w:t xml:space="preserve">/Azure Monitor se </w:t>
+            </w:r>
+            <w:proofErr w:type="gramStart"/>
+            <w:r>
+              <w:rPr>
+                <w:sz w:val="16"/>
+              </w:rPr>
+              <w:t>usara</w:t>
+            </w:r>
+            <w:proofErr w:type="gramEnd"/>
+            <w:r>
+              <w:rPr>
+                <w:sz w:val="16"/>
+              </w:rPr>
+              <w:t xml:space="preserve"> para </w:t>
+            </w:r>
+            <w:proofErr w:type="spellStart"/>
+            <w:r>
+              <w:rPr>
+                <w:sz w:val="16"/>
+              </w:rPr>
+              <w:t>telemetria</w:t>
+            </w:r>
+            <w:proofErr w:type="spellEnd"/>
+            <w:r>
+              <w:rPr>
+                <w:sz w:val="16"/>
+              </w:rPr>
+              <w:t xml:space="preserve">, </w:t>
+            </w:r>
+            <w:proofErr w:type="spellStart"/>
+            <w:r>
+              <w:rPr>
+                <w:sz w:val="16"/>
+              </w:rPr>
+              <w:t>diagnostico</w:t>
+            </w:r>
+            <w:proofErr w:type="spellEnd"/>
+            <w:r>
+              <w:rPr>
+                <w:sz w:val="16"/>
+              </w:rPr>
+              <w:t xml:space="preserve"> y </w:t>
+            </w:r>
+            <w:proofErr w:type="spellStart"/>
+            <w:r>
+              <w:rPr>
+                <w:sz w:val="16"/>
+              </w:rPr>
+              <w:t>analisis</w:t>
+            </w:r>
+            <w:proofErr w:type="spellEnd"/>
+            <w:r>
+              <w:rPr>
+                <w:sz w:val="16"/>
+              </w:rPr>
+              <w:t xml:space="preserve"> de uso. Las fuentes oficiales de Microsoft indican que Web Chat puede integrarse en sitios web mediante JavaScript o </w:t>
+            </w:r>
+            <w:proofErr w:type="spellStart"/>
+            <w:r>
+              <w:rPr>
+                <w:sz w:val="16"/>
+              </w:rPr>
+              <w:t>React</w:t>
+            </w:r>
+            <w:proofErr w:type="spellEnd"/>
+            <w:r>
+              <w:rPr>
+                <w:sz w:val="16"/>
+              </w:rPr>
+              <w:t xml:space="preserve"> y que </w:t>
+            </w:r>
+            <w:proofErr w:type="spellStart"/>
+            <w:r>
+              <w:rPr>
+                <w:sz w:val="16"/>
+              </w:rPr>
+              <w:t>Application</w:t>
+            </w:r>
+            <w:proofErr w:type="spellEnd"/>
+            <w:r>
+              <w:rPr>
+                <w:sz w:val="16"/>
+              </w:rPr>
+              <w:t xml:space="preserve"> </w:t>
+            </w:r>
+            <w:proofErr w:type="spellStart"/>
+            <w:r>
+              <w:rPr>
+                <w:sz w:val="16"/>
+              </w:rPr>
+              <w:t>Insights</w:t>
+            </w:r>
+            <w:proofErr w:type="spellEnd"/>
+            <w:r>
+              <w:rPr>
+                <w:sz w:val="16"/>
+              </w:rPr>
+              <w:t xml:space="preserve"> permite visualizar disponibilidad, rendimiento y uso del </w:t>
+            </w:r>
+            <w:proofErr w:type="spellStart"/>
+            <w:r>
+              <w:rPr>
+                <w:sz w:val="16"/>
+              </w:rPr>
+              <w:t>bot</w:t>
+            </w:r>
+            <w:proofErr w:type="spellEnd"/>
+            <w:r>
+              <w:rPr>
+                <w:sz w:val="16"/>
+              </w:rPr>
+              <w:t>.</w:t>
             </w:r>
           </w:p>
           <w:p>
@@ -4328,8 +6271,17 @@
                 <w:b/>
                 <w:sz w:val="20"/>
               </w:rPr>
-              <w:t>4. Plan de implementacion</w:t>
-            </w:r>
+              <w:t xml:space="preserve">4. Plan de </w:t>
+            </w:r>
+            <w:proofErr w:type="spellStart"/>
+            <w:r>
+              <w:rPr>
+                <w:b/>
+                <w:sz w:val="20"/>
+              </w:rPr>
+              <w:t>implementacion</w:t>
+            </w:r>
+            <w:proofErr w:type="spellEnd"/>
           </w:p>
           <w:p>
             <w:pPr>
@@ -4339,7 +6291,21 @@
               <w:rPr>
                 <w:sz w:val="16"/>
               </w:rPr>
-              <w:t>Fase 1 - Diagnostico: analizar transcripciones, formularios, busquedas internas y consultas de ventas para construir una matriz de preguntas frecuentes.</w:t>
+              <w:t xml:space="preserve">Fase 1 - Diagnostico: analizar transcripciones, formularios, </w:t>
+            </w:r>
+            <w:proofErr w:type="spellStart"/>
+            <w:r>
+              <w:rPr>
+                <w:sz w:val="16"/>
+              </w:rPr>
+              <w:t>busquedas</w:t>
+            </w:r>
+            <w:proofErr w:type="spellEnd"/>
+            <w:r>
+              <w:rPr>
+                <w:sz w:val="16"/>
+              </w:rPr>
+              <w:t xml:space="preserve"> internas y consultas de ventas para construir una matriz de preguntas frecuentes.</w:t>
             </w:r>
           </w:p>
           <w:p>
@@ -4350,7 +6316,49 @@
               <w:rPr>
                 <w:sz w:val="16"/>
               </w:rPr>
-              <w:t>Fase 2 - Diseno: definir intenciones, entidades, respuestas, politicas de escalamiento y tono de comunicacion.</w:t>
+              <w:t xml:space="preserve">Fase 2 - </w:t>
+            </w:r>
+            <w:proofErr w:type="spellStart"/>
+            <w:r>
+              <w:rPr>
+                <w:sz w:val="16"/>
+              </w:rPr>
+              <w:t>Diseno</w:t>
+            </w:r>
+            <w:proofErr w:type="spellEnd"/>
+            <w:r>
+              <w:rPr>
+                <w:sz w:val="16"/>
+              </w:rPr>
+              <w:t xml:space="preserve">: definir intenciones, entidades, respuestas, </w:t>
+            </w:r>
+            <w:proofErr w:type="spellStart"/>
+            <w:r>
+              <w:rPr>
+                <w:sz w:val="16"/>
+              </w:rPr>
+              <w:t>politicas</w:t>
+            </w:r>
+            <w:proofErr w:type="spellEnd"/>
+            <w:r>
+              <w:rPr>
+                <w:sz w:val="16"/>
+              </w:rPr>
+              <w:t xml:space="preserve"> de escalamiento y tono de </w:t>
+            </w:r>
+            <w:proofErr w:type="spellStart"/>
+            <w:r>
+              <w:rPr>
+                <w:sz w:val="16"/>
+              </w:rPr>
+              <w:t>comunicacion</w:t>
+            </w:r>
+            <w:proofErr w:type="spellEnd"/>
+            <w:r>
+              <w:rPr>
+                <w:sz w:val="16"/>
+              </w:rPr>
+              <w:t>.</w:t>
             </w:r>
           </w:p>
           <w:p>
@@ -4361,7 +6369,49 @@
               <w:rPr>
                 <w:sz w:val="16"/>
               </w:rPr>
-              <w:t>Fase 3 - Construccion: crear el agente en Copilot Studio, cargar fuentes de conocimiento, configurar temas y acciones con APIs de catalogo/pedidos.</w:t>
+              <w:t xml:space="preserve">Fase 3 - </w:t>
+            </w:r>
+            <w:proofErr w:type="spellStart"/>
+            <w:r>
+              <w:rPr>
+                <w:sz w:val="16"/>
+              </w:rPr>
+              <w:t>Construccion</w:t>
+            </w:r>
+            <w:proofErr w:type="spellEnd"/>
+            <w:r>
+              <w:rPr>
+                <w:sz w:val="16"/>
+              </w:rPr>
+              <w:t xml:space="preserve">: crear el agente en </w:t>
+            </w:r>
+            <w:proofErr w:type="spellStart"/>
+            <w:r>
+              <w:rPr>
+                <w:sz w:val="16"/>
+              </w:rPr>
+              <w:t>Copilot</w:t>
+            </w:r>
+            <w:proofErr w:type="spellEnd"/>
+            <w:r>
+              <w:rPr>
+                <w:sz w:val="16"/>
+              </w:rPr>
+              <w:t xml:space="preserve"> Studio, cargar fuentes de conocimiento, configurar temas y acciones con </w:t>
+            </w:r>
+            <w:proofErr w:type="spellStart"/>
+            <w:r>
+              <w:rPr>
+                <w:sz w:val="16"/>
+              </w:rPr>
+              <w:t>APIs</w:t>
+            </w:r>
+            <w:proofErr w:type="spellEnd"/>
+            <w:r>
+              <w:rPr>
+                <w:sz w:val="16"/>
+              </w:rPr>
+              <w:t xml:space="preserve"> de catalogo/pedidos.</w:t>
             </w:r>
           </w:p>
           <w:p>
@@ -4372,7 +6422,49 @@
               <w:rPr>
                 <w:sz w:val="16"/>
               </w:rPr>
-              <w:t>Fase 4 - Integracion: publicar el chatbot en el sitio web con Web Chat/Direct Line o canal web de Copilot Studio, respetando identidad visual y accesibilidad.</w:t>
+              <w:t xml:space="preserve">Fase 4 - </w:t>
+            </w:r>
+            <w:proofErr w:type="spellStart"/>
+            <w:r>
+              <w:rPr>
+                <w:sz w:val="16"/>
+              </w:rPr>
+              <w:t>Integracion</w:t>
+            </w:r>
+            <w:proofErr w:type="spellEnd"/>
+            <w:r>
+              <w:rPr>
+                <w:sz w:val="16"/>
+              </w:rPr>
+              <w:t xml:space="preserve">: publicar el </w:t>
+            </w:r>
+            <w:proofErr w:type="spellStart"/>
+            <w:r>
+              <w:rPr>
+                <w:sz w:val="16"/>
+              </w:rPr>
+              <w:t>chatbot</w:t>
+            </w:r>
+            <w:proofErr w:type="spellEnd"/>
+            <w:r>
+              <w:rPr>
+                <w:sz w:val="16"/>
+              </w:rPr>
+              <w:t xml:space="preserve"> en el sitio web con Web Chat/Direct Line o canal web de </w:t>
+            </w:r>
+            <w:proofErr w:type="spellStart"/>
+            <w:r>
+              <w:rPr>
+                <w:sz w:val="16"/>
+              </w:rPr>
+              <w:t>Copilot</w:t>
+            </w:r>
+            <w:proofErr w:type="spellEnd"/>
+            <w:r>
+              <w:rPr>
+                <w:sz w:val="16"/>
+              </w:rPr>
+              <w:t xml:space="preserve"> Studio, respetando identidad visual y accesibilidad.</w:t>
             </w:r>
           </w:p>
           <w:p>
@@ -4394,7 +6486,21 @@
               <w:rPr>
                 <w:sz w:val="16"/>
               </w:rPr>
-              <w:t>Fase 6 - Piloto y mejora: desplegar a un porcentaje de usuarios, medir metricas y optimizar temas antes del despliegue total.</w:t>
+              <w:t xml:space="preserve">Fase 6 - Piloto y mejora: desplegar a un porcentaje de usuarios, medir </w:t>
+            </w:r>
+            <w:proofErr w:type="spellStart"/>
+            <w:r>
+              <w:rPr>
+                <w:sz w:val="16"/>
+              </w:rPr>
+              <w:t>metricas</w:t>
+            </w:r>
+            <w:proofErr w:type="spellEnd"/>
+            <w:r>
+              <w:rPr>
+                <w:sz w:val="16"/>
+              </w:rPr>
+              <w:t xml:space="preserve"> y optimizar temas antes del despliegue total.</w:t>
             </w:r>
           </w:p>
           <w:p>
@@ -4417,7 +6523,35 @@
               <w:rPr>
                 <w:sz w:val="16"/>
               </w:rPr>
-              <w:t>Seguridad: minimizar datos personales, evitar exponer claves de Direct Line en el cliente, usar tokens generados por backend, aplicar HTTPS, control de acceso y retencion responsable de transcripciones.</w:t>
+              <w:t xml:space="preserve">Seguridad: minimizar datos personales, evitar exponer claves de Direct Line en el cliente, usar tokens generados por </w:t>
+            </w:r>
+            <w:proofErr w:type="spellStart"/>
+            <w:r>
+              <w:rPr>
+                <w:sz w:val="16"/>
+              </w:rPr>
+              <w:t>backend</w:t>
+            </w:r>
+            <w:proofErr w:type="spellEnd"/>
+            <w:r>
+              <w:rPr>
+                <w:sz w:val="16"/>
+              </w:rPr>
+              <w:t xml:space="preserve">, aplicar HTTPS, control de acceso y </w:t>
+            </w:r>
+            <w:proofErr w:type="spellStart"/>
+            <w:r>
+              <w:rPr>
+                <w:sz w:val="16"/>
+              </w:rPr>
+              <w:t>retencion</w:t>
+            </w:r>
+            <w:proofErr w:type="spellEnd"/>
+            <w:r>
+              <w:rPr>
+                <w:sz w:val="16"/>
+              </w:rPr>
+              <w:t xml:space="preserve"> responsable de transcripciones.</w:t>
             </w:r>
           </w:p>
           <w:p>
@@ -4428,7 +6562,35 @@
               <w:rPr>
                 <w:sz w:val="16"/>
               </w:rPr>
-              <w:t>Calidad: probar preguntas frecuentes, variantes de lenguaje, disponibilidad de integraciones, respuestas sin informacion suficiente y experiencia movil.</w:t>
+              <w:t xml:space="preserve">Calidad: probar preguntas frecuentes, variantes de lenguaje, disponibilidad de integraciones, respuestas sin </w:t>
+            </w:r>
+            <w:proofErr w:type="spellStart"/>
+            <w:r>
+              <w:rPr>
+                <w:sz w:val="16"/>
+              </w:rPr>
+              <w:t>informacion</w:t>
+            </w:r>
+            <w:proofErr w:type="spellEnd"/>
+            <w:r>
+              <w:rPr>
+                <w:sz w:val="16"/>
+              </w:rPr>
+              <w:t xml:space="preserve"> suficiente y experiencia </w:t>
+            </w:r>
+            <w:proofErr w:type="spellStart"/>
+            <w:r>
+              <w:rPr>
+                <w:sz w:val="16"/>
+              </w:rPr>
+              <w:t>movil</w:t>
+            </w:r>
+            <w:proofErr w:type="spellEnd"/>
+            <w:r>
+              <w:rPr>
+                <w:sz w:val="16"/>
+              </w:rPr>
+              <w:t>.</w:t>
             </w:r>
           </w:p>
           <w:p>
@@ -4439,7 +6601,49 @@
               <w:rPr>
                 <w:sz w:val="16"/>
               </w:rPr>
-              <w:t>Medio ambiente: usar servicios cloud escalables bajo demanda, evitar infraestructura sobredimensionada y reutilizar documentacion digital para capacitacion y mejora continua.</w:t>
+              <w:t xml:space="preserve">Medio ambiente: usar servicios </w:t>
+            </w:r>
+            <w:proofErr w:type="spellStart"/>
+            <w:r>
+              <w:rPr>
+                <w:sz w:val="16"/>
+              </w:rPr>
+              <w:t>cloud</w:t>
+            </w:r>
+            <w:proofErr w:type="spellEnd"/>
+            <w:r>
+              <w:rPr>
+                <w:sz w:val="16"/>
+              </w:rPr>
+              <w:t xml:space="preserve"> escalables bajo demanda, evitar infraestructura sobredimensionada y reutilizar </w:t>
+            </w:r>
+            <w:proofErr w:type="spellStart"/>
+            <w:r>
+              <w:rPr>
+                <w:sz w:val="16"/>
+              </w:rPr>
+              <w:t>documentacion</w:t>
+            </w:r>
+            <w:proofErr w:type="spellEnd"/>
+            <w:r>
+              <w:rPr>
+                <w:sz w:val="16"/>
+              </w:rPr>
+              <w:t xml:space="preserve"> digital para </w:t>
+            </w:r>
+            <w:proofErr w:type="spellStart"/>
+            <w:r>
+              <w:rPr>
+                <w:sz w:val="16"/>
+              </w:rPr>
+              <w:t>capacitacion</w:t>
+            </w:r>
+            <w:proofErr w:type="spellEnd"/>
+            <w:r>
+              <w:rPr>
+                <w:sz w:val="16"/>
+              </w:rPr>
+              <w:t xml:space="preserve"> y mejora continua.</w:t>
             </w:r>
           </w:p>
           <w:p>
@@ -4451,8 +6655,17 @@
                 <w:b/>
                 <w:sz w:val="20"/>
               </w:rPr>
-              <w:t>6. Indicadores de exito</w:t>
-            </w:r>
+              <w:t xml:space="preserve">6. Indicadores de </w:t>
+            </w:r>
+            <w:proofErr w:type="spellStart"/>
+            <w:r>
+              <w:rPr>
+                <w:b/>
+                <w:sz w:val="20"/>
+              </w:rPr>
+              <w:t>exito</w:t>
+            </w:r>
+            <w:proofErr w:type="spellEnd"/>
           </w:p>
           <w:p>
             <w:pPr>
@@ -4473,7 +6686,21 @@
               <w:rPr>
                 <w:sz w:val="16"/>
               </w:rPr>
-              <w:t>Resolver automaticamente al menos 60% de preguntas frecuentes del sitio.</w:t>
+              <w:t xml:space="preserve">Resolver </w:t>
+            </w:r>
+            <w:proofErr w:type="spellStart"/>
+            <w:r>
+              <w:rPr>
+                <w:sz w:val="16"/>
+              </w:rPr>
+              <w:t>automaticamente</w:t>
+            </w:r>
+            <w:proofErr w:type="spellEnd"/>
+            <w:r>
+              <w:rPr>
+                <w:sz w:val="16"/>
+              </w:rPr>
+              <w:t xml:space="preserve"> al menos 60% de preguntas frecuentes del sitio.</w:t>
             </w:r>
           </w:p>
           <w:p>
@@ -4495,13 +6722,7 @@
               <w:rPr>
                 <w:sz w:val="16"/>
               </w:rPr>
-              <w:t xml:space="preserve">Detectar </w:t>
-            </w:r>
-            <w:r>
-              <w:rPr>
-                <w:sz w:val="16"/>
-              </w:rPr>
-              <w:t>semanalmente nuevas preguntas sin respuesta y convertirlas en mejoras del flujo.</w:t>
+              <w:t>Detectar semanalmente nuevas preguntas sin respuesta y convertirlas en mejoras del flujo.</w:t>
             </w:r>
           </w:p>
           <w:p>
@@ -4535,24 +6756,68 @@
               <w:rPr>
                 <w:sz w:val="16"/>
               </w:rPr>
-              <w:t xml:space="preserve">Especificaciones tecnicas: procesador, memoria, almacenamiento, </w:t>
-            </w:r>
-            <w:r>
-              <w:rPr>
-                <w:sz w:val="16"/>
-              </w:rPr>
-              <w:t>garantia y compatibilidad.</w:t>
+              <w:t xml:space="preserve">Especificaciones </w:t>
+            </w:r>
+            <w:proofErr w:type="spellStart"/>
+            <w:r>
+              <w:rPr>
+                <w:sz w:val="16"/>
+              </w:rPr>
+              <w:t>tecnicas</w:t>
+            </w:r>
+            <w:proofErr w:type="spellEnd"/>
+            <w:r>
+              <w:rPr>
+                <w:sz w:val="16"/>
+              </w:rPr>
+              <w:t xml:space="preserve">: procesador, memoria, almacenamiento, </w:t>
+            </w:r>
+            <w:proofErr w:type="spellStart"/>
+            <w:r>
+              <w:rPr>
+                <w:sz w:val="16"/>
+              </w:rPr>
+              <w:t>garantia</w:t>
+            </w:r>
+            <w:proofErr w:type="spellEnd"/>
+            <w:r>
+              <w:rPr>
+                <w:sz w:val="16"/>
+              </w:rPr>
+              <w:t xml:space="preserve"> y compatibilidad.</w:t>
             </w:r>
           </w:p>
           <w:p>
             <w:pPr>
               <w:spacing w:after="40"/>
             </w:pPr>
-            <w:r>
-              <w:rPr>
-                <w:sz w:val="16"/>
-              </w:rPr>
-              <w:t>Metodos de pago aceptados, cuotas, validacion de pago y comprobante.</w:t>
+            <w:proofErr w:type="spellStart"/>
+            <w:r>
+              <w:rPr>
+                <w:sz w:val="16"/>
+              </w:rPr>
+              <w:t>Metodos</w:t>
+            </w:r>
+            <w:proofErr w:type="spellEnd"/>
+            <w:r>
+              <w:rPr>
+                <w:sz w:val="16"/>
+              </w:rPr>
+              <w:t xml:space="preserve"> de pago aceptados, cuotas, </w:t>
+            </w:r>
+            <w:proofErr w:type="spellStart"/>
+            <w:r>
+              <w:rPr>
+                <w:sz w:val="16"/>
+              </w:rPr>
+              <w:t>validacion</w:t>
+            </w:r>
+            <w:proofErr w:type="spellEnd"/>
+            <w:r>
+              <w:rPr>
+                <w:sz w:val="16"/>
+              </w:rPr>
+              <w:t xml:space="preserve"> de pago y comprobante.</w:t>
             </w:r>
           </w:p>
           <w:p>
@@ -4563,7 +6828,21 @@
               <w:rPr>
                 <w:sz w:val="16"/>
               </w:rPr>
-              <w:t>Costos y tiempos de envio, cobertura por zona y retiro en tienda.</w:t>
+              <w:t xml:space="preserve">Costos y tiempos de </w:t>
+            </w:r>
+            <w:proofErr w:type="spellStart"/>
+            <w:r>
+              <w:rPr>
+                <w:sz w:val="16"/>
+              </w:rPr>
+              <w:t>envio</w:t>
+            </w:r>
+            <w:proofErr w:type="spellEnd"/>
+            <w:r>
+              <w:rPr>
+                <w:sz w:val="16"/>
+              </w:rPr>
+              <w:t>, cobertura por zona y retiro en tienda.</w:t>
             </w:r>
           </w:p>
           <w:p>
@@ -4574,18 +6853,96 @@
               <w:rPr>
                 <w:sz w:val="16"/>
               </w:rPr>
-              <w:t>Estado del pedido, cambios, devoluciones y politicas de garantia.</w:t>
+              <w:t xml:space="preserve">Estado del pedido, cambios, devoluciones y </w:t>
+            </w:r>
+            <w:proofErr w:type="spellStart"/>
+            <w:r>
+              <w:rPr>
+                <w:sz w:val="16"/>
+              </w:rPr>
+              <w:t>politicas</w:t>
+            </w:r>
+            <w:proofErr w:type="spellEnd"/>
+            <w:r>
+              <w:rPr>
+                <w:sz w:val="16"/>
+              </w:rPr>
+              <w:t xml:space="preserve"> de </w:t>
+            </w:r>
+            <w:proofErr w:type="spellStart"/>
+            <w:r>
+              <w:rPr>
+                <w:sz w:val="16"/>
+              </w:rPr>
+              <w:t>garantia</w:t>
+            </w:r>
+            <w:proofErr w:type="spellEnd"/>
+            <w:r>
+              <w:rPr>
+                <w:sz w:val="16"/>
+              </w:rPr>
+              <w:t>.</w:t>
             </w:r>
           </w:p>
           <w:p>
             <w:pPr>
               <w:spacing w:after="40"/>
             </w:pPr>
-            <w:r>
-              <w:rPr>
-                <w:sz w:val="16"/>
-              </w:rPr>
-              <w:t>Recomendacion de producto segun presupuesto y uso: estudios, gaming, oficina o diseno.</w:t>
+            <w:proofErr w:type="spellStart"/>
+            <w:r>
+              <w:rPr>
+                <w:sz w:val="16"/>
+              </w:rPr>
+              <w:t>Recomendacion</w:t>
+            </w:r>
+            <w:proofErr w:type="spellEnd"/>
+            <w:r>
+              <w:rPr>
+                <w:sz w:val="16"/>
+              </w:rPr>
+              <w:t xml:space="preserve"> de producto </w:t>
+            </w:r>
+            <w:proofErr w:type="spellStart"/>
+            <w:r>
+              <w:rPr>
+                <w:sz w:val="16"/>
+              </w:rPr>
+              <w:t>segun</w:t>
+            </w:r>
+            <w:proofErr w:type="spellEnd"/>
+            <w:r>
+              <w:rPr>
+                <w:sz w:val="16"/>
+              </w:rPr>
+              <w:t xml:space="preserve"> presupuesto y uso: estudios, </w:t>
+            </w:r>
+            <w:proofErr w:type="spellStart"/>
+            <w:r>
+              <w:rPr>
+                <w:sz w:val="16"/>
+              </w:rPr>
+              <w:t>gaming</w:t>
+            </w:r>
+            <w:proofErr w:type="spellEnd"/>
+            <w:r>
+              <w:rPr>
+                <w:sz w:val="16"/>
+              </w:rPr>
+              <w:t xml:space="preserve">, oficina o </w:t>
+            </w:r>
+            <w:proofErr w:type="spellStart"/>
+            <w:r>
+              <w:rPr>
+                <w:sz w:val="16"/>
+              </w:rPr>
+              <w:t>diseno</w:t>
+            </w:r>
+            <w:proofErr w:type="spellEnd"/>
+            <w:r>
+              <w:rPr>
+                <w:sz w:val="16"/>
+              </w:rPr>
+              <w:t>.</w:t>
             </w:r>
           </w:p>
           <w:p>
@@ -4596,7 +6953,49 @@
               <w:rPr>
                 <w:sz w:val="16"/>
               </w:rPr>
-              <w:t>Soporte tecnico basico: configuracion inicial, fallas comunes y contacto con soporte humano.</w:t>
+              <w:t xml:space="preserve">Soporte </w:t>
+            </w:r>
+            <w:proofErr w:type="spellStart"/>
+            <w:r>
+              <w:rPr>
+                <w:sz w:val="16"/>
+              </w:rPr>
+              <w:t>tecnico</w:t>
+            </w:r>
+            <w:proofErr w:type="spellEnd"/>
+            <w:r>
+              <w:rPr>
+                <w:sz w:val="16"/>
+              </w:rPr>
+              <w:t xml:space="preserve"> </w:t>
+            </w:r>
+            <w:proofErr w:type="spellStart"/>
+            <w:r>
+              <w:rPr>
+                <w:sz w:val="16"/>
+              </w:rPr>
+              <w:t>basico</w:t>
+            </w:r>
+            <w:proofErr w:type="spellEnd"/>
+            <w:r>
+              <w:rPr>
+                <w:sz w:val="16"/>
+              </w:rPr>
+              <w:t xml:space="preserve">: </w:t>
+            </w:r>
+            <w:proofErr w:type="spellStart"/>
+            <w:r>
+              <w:rPr>
+                <w:sz w:val="16"/>
+              </w:rPr>
+              <w:t>configuracion</w:t>
+            </w:r>
+            <w:proofErr w:type="spellEnd"/>
+            <w:r>
+              <w:rPr>
+                <w:sz w:val="16"/>
+              </w:rPr>
+              <w:t xml:space="preserve"> inicial, fallas comunes y contacto con soporte humano.</w:t>
             </w:r>
           </w:p>
           <w:p>
@@ -4619,6 +7018,7 @@
               <w:rPr>
                 <w:noProof/>
               </w:rPr>
+              <w:lastRenderedPageBreak/>
               <w:drawing>
                 <wp:inline distT="0" distB="0" distL="0" distR="0" wp14:anchorId="7A6E9404" wp14:editId="7F315782">
                   <wp:extent cx="5760720" cy="3533242"/>
@@ -4721,16 +7121,48 @@
               <w:rPr>
                 <w:sz w:val="14"/>
               </w:rPr>
-              <w:t>Microsoft Copilot Studio documentation: https://learn.microsoft.com/en-us/microsoft-copilot-studio/</w:t>
+              <w:t xml:space="preserve">Microsoft </w:t>
+            </w:r>
+            <w:proofErr w:type="spellStart"/>
+            <w:r>
+              <w:rPr>
+                <w:sz w:val="14"/>
+              </w:rPr>
+              <w:t>Copilot</w:t>
+            </w:r>
+            <w:proofErr w:type="spellEnd"/>
+            <w:r>
+              <w:rPr>
+                <w:sz w:val="14"/>
+              </w:rPr>
+              <w:t xml:space="preserve"> Studio </w:t>
+            </w:r>
+            <w:proofErr w:type="spellStart"/>
+            <w:r>
+              <w:rPr>
+                <w:sz w:val="14"/>
+              </w:rPr>
+              <w:t>documentation</w:t>
+            </w:r>
+            <w:proofErr w:type="spellEnd"/>
+            <w:r>
+              <w:rPr>
+                <w:sz w:val="14"/>
+              </w:rPr>
+              <w:t>: https://learn.microsoft.com/en-us/microsoft-copilot-studio/</w:t>
             </w:r>
           </w:p>
           <w:p>
             <w:pPr>
               <w:spacing w:after="20"/>
+              <w:rPr>
+                <w:lang w:val="en-US"/>
+              </w:rPr>
             </w:pPr>
             <w:r>
               <w:rPr>
                 <w:sz w:val="14"/>
+                <w:lang w:val="en-US"/>
               </w:rPr>
               <w:t>Explore AI capabilities in Copilot Studio: https://learn.microsoft.com/en-us/microsoft-copilot-studio/guidance/ai-capabilities</w:t>
             </w:r>
@@ -4738,10 +7170,14 @@
           <w:p>
             <w:pPr>
               <w:spacing w:after="20"/>
+              <w:rPr>
+                <w:lang w:val="en-US"/>
+              </w:rPr>
             </w:pPr>
             <w:r>
               <w:rPr>
                 <w:sz w:val="14"/>
+                <w:lang w:val="en-US"/>
               </w:rPr>
               <w:t>Web Chat overview - Azure AI Bot Service: https://learn.microsoft.com/en-us/azure/bot-service/bot-builder-webchat-overview?view=azure-bot-service-4.0</w:t>
             </w:r>
@@ -4749,10 +7185,14 @@
           <w:p>
             <w:pPr>
               <w:spacing w:after="20"/>
+              <w:rPr>
+                <w:lang w:val="en-US"/>
+              </w:rPr>
             </w:pPr>
             <w:r>
               <w:rPr>
                 <w:sz w:val="14"/>
+                <w:lang w:val="en-US"/>
               </w:rPr>
               <w:t>About Direct Line - Azure Bot Service: https://learn.microsoft.com/en-gb/azure/bot-service/bot-service-channel-directline?view=azure-bot-service-4.0</w:t>
             </w:r>
@@ -4760,10 +7200,14 @@
           <w:p>
             <w:pPr>
               <w:spacing w:after="20"/>
+              <w:rPr>
+                <w:lang w:val="en-US"/>
+              </w:rPr>
             </w:pPr>
             <w:r>
               <w:rPr>
                 <w:sz w:val="14"/>
+                <w:lang w:val="en-US"/>
               </w:rPr>
               <w:t>Add telemetry to your bot - Azure Bot Service: https://learn.microsoft.com/en-us/azure/bot-service/bot-builder-telemetry?view=azure-bot-service-4.0</w:t>
             </w:r>
@@ -4783,6 +7227,7 @@
           <w:b/>
           <w:sz w:val="20"/>
           <w:szCs w:val="20"/>
+          <w:lang w:val="en-US"/>
         </w:rPr>
       </w:pPr>
     </w:p>
@@ -4797,6 +7242,7 @@
           <w:b/>
           <w:sz w:val="20"/>
           <w:szCs w:val="20"/>
+          <w:lang w:val="en-US"/>
         </w:rPr>
       </w:pPr>
     </w:p>
@@ -4811,6 +7257,7 @@
           <w:b/>
           <w:sz w:val="20"/>
           <w:szCs w:val="20"/>
+          <w:lang w:val="en-US"/>
         </w:rPr>
       </w:pPr>
       <w:r>
@@ -4819,6 +7266,7 @@
           <w:b/>
           <w:sz w:val="20"/>
           <w:szCs w:val="20"/>
+          <w:lang w:val="en-US"/>
         </w:rPr>
         <w:br w:type="page"/>
       </w:r>
@@ -4840,6 +7288,7 @@
           <w:noProof/>
           <w:sz w:val="20"/>
         </w:rPr>
+        <w:lastRenderedPageBreak/>
         <mc:AlternateContent>
           <mc:Choice Requires="wps">
             <w:drawing>
@@ -5277,7 +7726,35 @@
               <w:rPr>
                 <w:sz w:val="16"/>
               </w:rPr>
-              <w:t>1. Levantar informacion del caso y analizar el flujo e-commerce.</w:t>
+              <w:t xml:space="preserve">1. Levantar </w:t>
+            </w:r>
+            <w:proofErr w:type="spellStart"/>
+            <w:r>
+              <w:rPr>
+                <w:sz w:val="16"/>
+              </w:rPr>
+              <w:t>informacion</w:t>
+            </w:r>
+            <w:proofErr w:type="spellEnd"/>
+            <w:r>
+              <w:rPr>
+                <w:sz w:val="16"/>
+              </w:rPr>
+              <w:t xml:space="preserve"> del caso y analizar el flujo e-</w:t>
+            </w:r>
+            <w:proofErr w:type="spellStart"/>
+            <w:r>
+              <w:rPr>
+                <w:sz w:val="16"/>
+              </w:rPr>
+              <w:t>commerce</w:t>
+            </w:r>
+            <w:proofErr w:type="spellEnd"/>
+            <w:r>
+              <w:rPr>
+                <w:sz w:val="16"/>
+              </w:rPr>
+              <w:t>.</w:t>
             </w:r>
           </w:p>
         </w:tc>
@@ -5291,7 +7768,21 @@
               <w:rPr>
                 <w:sz w:val="16"/>
               </w:rPr>
-              <w:t>Documentar fuentes de informacion, respetar privacidad de clientes y usar datos anonimizados.</w:t>
+              <w:t xml:space="preserve">Documentar fuentes de </w:t>
+            </w:r>
+            <w:proofErr w:type="spellStart"/>
+            <w:r>
+              <w:rPr>
+                <w:sz w:val="16"/>
+              </w:rPr>
+              <w:t>informacion</w:t>
+            </w:r>
+            <w:proofErr w:type="spellEnd"/>
+            <w:r>
+              <w:rPr>
+                <w:sz w:val="16"/>
+              </w:rPr>
+              <w:t>, respetar privacidad de clientes y usar datos anonimizados.</w:t>
             </w:r>
           </w:p>
         </w:tc>
@@ -5310,13 +7801,21 @@
               <w:rPr>
                 <w:sz w:val="16"/>
               </w:rPr>
-              <w:t xml:space="preserve">2. Identificar </w:t>
-            </w:r>
-            <w:r>
-              <w:rPr>
-                <w:sz w:val="16"/>
-              </w:rPr>
-              <w:t>preguntas frecuentes y agruparlas por intencion.</w:t>
+              <w:t xml:space="preserve">2. Identificar preguntas frecuentes y agruparlas por </w:t>
+            </w:r>
+            <w:proofErr w:type="spellStart"/>
+            <w:r>
+              <w:rPr>
+                <w:sz w:val="16"/>
+              </w:rPr>
+              <w:t>intencion</w:t>
+            </w:r>
+            <w:proofErr w:type="spellEnd"/>
+            <w:r>
+              <w:rPr>
+                <w:sz w:val="16"/>
+              </w:rPr>
+              <w:t>.</w:t>
             </w:r>
           </w:p>
         </w:tc>
@@ -5349,7 +7848,21 @@
               <w:rPr>
                 <w:sz w:val="16"/>
               </w:rPr>
-              <w:t>3. Disenar mapa conversacional y reglas de escalamiento.</w:t>
+              <w:t xml:space="preserve">3. </w:t>
+            </w:r>
+            <w:proofErr w:type="spellStart"/>
+            <w:r>
+              <w:rPr>
+                <w:sz w:val="16"/>
+              </w:rPr>
+              <w:t>Disenar</w:t>
+            </w:r>
+            <w:proofErr w:type="spellEnd"/>
+            <w:r>
+              <w:rPr>
+                <w:sz w:val="16"/>
+              </w:rPr>
+              <w:t xml:space="preserve"> mapa conversacional y reglas de escalamiento.</w:t>
             </w:r>
           </w:p>
         </w:tc>
@@ -5382,7 +7895,35 @@
               <w:rPr>
                 <w:sz w:val="16"/>
               </w:rPr>
-              <w:t>4. Seleccionar plataforma: Copilot Studio + Azure Bot Service/Web Chat.</w:t>
+              <w:t xml:space="preserve">4. Seleccionar plataforma: </w:t>
+            </w:r>
+            <w:proofErr w:type="spellStart"/>
+            <w:r>
+              <w:rPr>
+                <w:sz w:val="16"/>
+              </w:rPr>
+              <w:t>Copilot</w:t>
+            </w:r>
+            <w:proofErr w:type="spellEnd"/>
+            <w:r>
+              <w:rPr>
+                <w:sz w:val="16"/>
+              </w:rPr>
+              <w:t xml:space="preserve"> Studio + Azure Bot </w:t>
+            </w:r>
+            <w:proofErr w:type="spellStart"/>
+            <w:r>
+              <w:rPr>
+                <w:sz w:val="16"/>
+              </w:rPr>
+              <w:t>Service</w:t>
+            </w:r>
+            <w:proofErr w:type="spellEnd"/>
+            <w:r>
+              <w:rPr>
+                <w:sz w:val="16"/>
+              </w:rPr>
+              <w:t>/Web Chat.</w:t>
             </w:r>
           </w:p>
         </w:tc>
@@ -5396,7 +7937,21 @@
               <w:rPr>
                 <w:sz w:val="16"/>
               </w:rPr>
-              <w:t>Usar documentacion oficial Microsoft y servicios compatibles con Azure.</w:t>
+              <w:t xml:space="preserve">Usar </w:t>
+            </w:r>
+            <w:proofErr w:type="spellStart"/>
+            <w:r>
+              <w:rPr>
+                <w:sz w:val="16"/>
+              </w:rPr>
+              <w:t>documentacion</w:t>
+            </w:r>
+            <w:proofErr w:type="spellEnd"/>
+            <w:r>
+              <w:rPr>
+                <w:sz w:val="16"/>
+              </w:rPr>
+              <w:t xml:space="preserve"> oficial Microsoft y servicios compatibles con Azure.</w:t>
             </w:r>
           </w:p>
         </w:tc>
@@ -5415,7 +7970,35 @@
               <w:rPr>
                 <w:sz w:val="16"/>
               </w:rPr>
-              <w:t>5. Crear base de conocimiento de productos, pagos, envios y garantias.</w:t>
+              <w:t xml:space="preserve">5. Crear base de conocimiento de productos, pagos, </w:t>
+            </w:r>
+            <w:proofErr w:type="spellStart"/>
+            <w:r>
+              <w:rPr>
+                <w:sz w:val="16"/>
+              </w:rPr>
+              <w:t>envios</w:t>
+            </w:r>
+            <w:proofErr w:type="spellEnd"/>
+            <w:r>
+              <w:rPr>
+                <w:sz w:val="16"/>
+              </w:rPr>
+              <w:t xml:space="preserve"> y </w:t>
+            </w:r>
+            <w:proofErr w:type="spellStart"/>
+            <w:r>
+              <w:rPr>
+                <w:sz w:val="16"/>
+              </w:rPr>
+              <w:t>garantias</w:t>
+            </w:r>
+            <w:proofErr w:type="spellEnd"/>
+            <w:r>
+              <w:rPr>
+                <w:sz w:val="16"/>
+              </w:rPr>
+              <w:t>.</w:t>
             </w:r>
           </w:p>
         </w:tc>
@@ -5448,7 +8031,21 @@
               <w:rPr>
                 <w:sz w:val="16"/>
               </w:rPr>
-              <w:t>6. Construir temas del chatbot y respuestas generativas controladas.</w:t>
+              <w:t xml:space="preserve">6. Construir temas del </w:t>
+            </w:r>
+            <w:proofErr w:type="spellStart"/>
+            <w:r>
+              <w:rPr>
+                <w:sz w:val="16"/>
+              </w:rPr>
+              <w:t>chatbot</w:t>
+            </w:r>
+            <w:proofErr w:type="spellEnd"/>
+            <w:r>
+              <w:rPr>
+                <w:sz w:val="16"/>
+              </w:rPr>
+              <w:t xml:space="preserve"> y respuestas generativas controladas.</w:t>
             </w:r>
           </w:p>
         </w:tc>
@@ -5462,7 +8059,21 @@
               <w:rPr>
                 <w:sz w:val="16"/>
               </w:rPr>
-              <w:t>Aplicar principios de IA responsable, revision humana y fuentes confiables.</w:t>
+              <w:t xml:space="preserve">Aplicar principios de IA responsable, </w:t>
+            </w:r>
+            <w:proofErr w:type="spellStart"/>
+            <w:r>
+              <w:rPr>
+                <w:sz w:val="16"/>
+              </w:rPr>
+              <w:t>revision</w:t>
+            </w:r>
+            <w:proofErr w:type="spellEnd"/>
+            <w:r>
+              <w:rPr>
+                <w:sz w:val="16"/>
+              </w:rPr>
+              <w:t xml:space="preserve"> humana y fuentes confiables.</w:t>
             </w:r>
           </w:p>
         </w:tc>
@@ -5481,7 +8092,21 @@
               <w:rPr>
                 <w:sz w:val="16"/>
               </w:rPr>
-              <w:t>7. Integrar con catalogo, stock, pedidos y soporte humano.</w:t>
+              <w:t xml:space="preserve">7. Integrar con </w:t>
+            </w:r>
+            <w:proofErr w:type="spellStart"/>
+            <w:r>
+              <w:rPr>
+                <w:sz w:val="16"/>
+              </w:rPr>
+              <w:t>catalogo</w:t>
+            </w:r>
+            <w:proofErr w:type="spellEnd"/>
+            <w:r>
+              <w:rPr>
+                <w:sz w:val="16"/>
+              </w:rPr>
+              <w:t>, stock, pedidos y soporte humano.</w:t>
             </w:r>
           </w:p>
         </w:tc>
@@ -5495,13 +8120,7 @@
               <w:rPr>
                 <w:sz w:val="16"/>
               </w:rPr>
-              <w:t xml:space="preserve">Proteger </w:t>
-            </w:r>
-            <w:r>
-              <w:rPr>
-                <w:sz w:val="16"/>
-              </w:rPr>
-              <w:t>credenciales, usar HTTPS y controlar permisos de API.</w:t>
+              <w:t>Proteger credenciales, usar HTTPS y controlar permisos de API.</w:t>
             </w:r>
           </w:p>
         </w:tc>
@@ -5534,7 +8153,35 @@
               <w:rPr>
                 <w:sz w:val="16"/>
               </w:rPr>
-              <w:t>No exponer secretos en front-end; generar tokens desde backend cuando use Direct Line.</w:t>
+              <w:t xml:space="preserve">No exponer secretos en </w:t>
+            </w:r>
+            <w:proofErr w:type="spellStart"/>
+            <w:r>
+              <w:rPr>
+                <w:sz w:val="16"/>
+              </w:rPr>
+              <w:t>front-end</w:t>
+            </w:r>
+            <w:proofErr w:type="spellEnd"/>
+            <w:r>
+              <w:rPr>
+                <w:sz w:val="16"/>
+              </w:rPr>
+              <w:t xml:space="preserve">; generar tokens desde </w:t>
+            </w:r>
+            <w:proofErr w:type="spellStart"/>
+            <w:r>
+              <w:rPr>
+                <w:sz w:val="16"/>
+              </w:rPr>
+              <w:t>backend</w:t>
+            </w:r>
+            <w:proofErr w:type="spellEnd"/>
+            <w:r>
+              <w:rPr>
+                <w:sz w:val="16"/>
+              </w:rPr>
+              <w:t xml:space="preserve"> cuando use Direct Line.</w:t>
             </w:r>
           </w:p>
         </w:tc>
@@ -5553,7 +8200,49 @@
               <w:rPr>
                 <w:sz w:val="16"/>
               </w:rPr>
-              <w:t>9. Configurar telemetria en Application Insights/Azure Monitor.</w:t>
+              <w:t xml:space="preserve">9. Configurar </w:t>
+            </w:r>
+            <w:proofErr w:type="spellStart"/>
+            <w:r>
+              <w:rPr>
+                <w:sz w:val="16"/>
+              </w:rPr>
+              <w:t>telemetria</w:t>
+            </w:r>
+            <w:proofErr w:type="spellEnd"/>
+            <w:r>
+              <w:rPr>
+                <w:sz w:val="16"/>
+              </w:rPr>
+              <w:t xml:space="preserve"> en </w:t>
+            </w:r>
+            <w:proofErr w:type="spellStart"/>
+            <w:r>
+              <w:rPr>
+                <w:sz w:val="16"/>
+              </w:rPr>
+              <w:t>Application</w:t>
+            </w:r>
+            <w:proofErr w:type="spellEnd"/>
+            <w:r>
+              <w:rPr>
+                <w:sz w:val="16"/>
+              </w:rPr>
+              <w:t xml:space="preserve"> </w:t>
+            </w:r>
+            <w:proofErr w:type="spellStart"/>
+            <w:r>
+              <w:rPr>
+                <w:sz w:val="16"/>
+              </w:rPr>
+              <w:t>Insights</w:t>
+            </w:r>
+            <w:proofErr w:type="spellEnd"/>
+            <w:r>
+              <w:rPr>
+                <w:sz w:val="16"/>
+              </w:rPr>
+              <w:t>/Azure Monitor.</w:t>
             </w:r>
           </w:p>
         </w:tc>
@@ -5600,7 +8289,49 @@
               <w:rPr>
                 <w:sz w:val="16"/>
               </w:rPr>
-              <w:t>Validar accesibilidad, navegacion movil, carga rapida y manejo de errores.</w:t>
+              <w:t xml:space="preserve">Validar accesibilidad, </w:t>
+            </w:r>
+            <w:proofErr w:type="spellStart"/>
+            <w:r>
+              <w:rPr>
+                <w:sz w:val="16"/>
+              </w:rPr>
+              <w:t>navegacion</w:t>
+            </w:r>
+            <w:proofErr w:type="spellEnd"/>
+            <w:r>
+              <w:rPr>
+                <w:sz w:val="16"/>
+              </w:rPr>
+              <w:t xml:space="preserve"> </w:t>
+            </w:r>
+            <w:proofErr w:type="spellStart"/>
+            <w:r>
+              <w:rPr>
+                <w:sz w:val="16"/>
+              </w:rPr>
+              <w:t>movil</w:t>
+            </w:r>
+            <w:proofErr w:type="spellEnd"/>
+            <w:r>
+              <w:rPr>
+                <w:sz w:val="16"/>
+              </w:rPr>
+              <w:t xml:space="preserve">, carga </w:t>
+            </w:r>
+            <w:proofErr w:type="spellStart"/>
+            <w:r>
+              <w:rPr>
+                <w:sz w:val="16"/>
+              </w:rPr>
+              <w:t>rapida</w:t>
+            </w:r>
+            <w:proofErr w:type="spellEnd"/>
+            <w:r>
+              <w:rPr>
+                <w:sz w:val="16"/>
+              </w:rPr>
+              <w:t xml:space="preserve"> y manejo de errores.</w:t>
             </w:r>
           </w:p>
         </w:tc>
@@ -5619,7 +8350,21 @@
               <w:rPr>
                 <w:sz w:val="16"/>
               </w:rPr>
-              <w:t>11. Lanzar piloto controlado y comparar contra linea base.</w:t>
+              <w:t xml:space="preserve">11. Lanzar piloto controlado y comparar contra </w:t>
+            </w:r>
+            <w:proofErr w:type="spellStart"/>
+            <w:r>
+              <w:rPr>
+                <w:sz w:val="16"/>
+              </w:rPr>
+              <w:t>linea</w:t>
+            </w:r>
+            <w:proofErr w:type="spellEnd"/>
+            <w:r>
+              <w:rPr>
+                <w:sz w:val="16"/>
+              </w:rPr>
+              <w:t xml:space="preserve"> base.</w:t>
             </w:r>
           </w:p>
         </w:tc>
@@ -5652,7 +8397,21 @@
               <w:rPr>
                 <w:sz w:val="16"/>
               </w:rPr>
-              <w:t>12. Optimizar continuamente a partir de metricas y transcripciones.</w:t>
+              <w:t xml:space="preserve">12. Optimizar continuamente a partir de </w:t>
+            </w:r>
+            <w:proofErr w:type="spellStart"/>
+            <w:r>
+              <w:rPr>
+                <w:sz w:val="16"/>
+              </w:rPr>
+              <w:t>metricas</w:t>
+            </w:r>
+            <w:proofErr w:type="spellEnd"/>
+            <w:r>
+              <w:rPr>
+                <w:sz w:val="16"/>
+              </w:rPr>
+              <w:t xml:space="preserve"> y transcripciones.</w:t>
             </w:r>
           </w:p>
         </w:tc>
@@ -5974,7 +8733,23 @@
                 <w:b/>
                 <w:sz w:val="18"/>
               </w:rPr>
-              <w:t>Mapa conversacional e integracion Azure propuesta</w:t>
+              <w:t xml:space="preserve">Mapa conversacional e </w:t>
+            </w:r>
+            <w:proofErr w:type="spellStart"/>
+            <w:r>
+              <w:rPr>
+                <w:b/>
+                <w:sz w:val="18"/>
+              </w:rPr>
+              <w:t>integracion</w:t>
+            </w:r>
+            <w:proofErr w:type="spellEnd"/>
+            <w:r>
+              <w:rPr>
+                <w:b/>
+                <w:sz w:val="18"/>
+              </w:rPr>
+              <w:t xml:space="preserve"> Azure propuesta</w:t>
             </w:r>
           </w:p>
           <w:p>
@@ -6170,8 +8945,33 @@
                 <w:b/>
                 <w:sz w:val="16"/>
               </w:rPr>
-              <w:t>Uso de chatbots en E-commerce</w:t>
-            </w:r>
+              <w:t xml:space="preserve">Uso de </w:t>
+            </w:r>
+            <w:proofErr w:type="spellStart"/>
+            <w:r>
+              <w:rPr>
+                <w:b/>
+                <w:sz w:val="16"/>
+              </w:rPr>
+              <w:t>chatbots</w:t>
+            </w:r>
+            <w:proofErr w:type="spellEnd"/>
+            <w:r>
+              <w:rPr>
+                <w:b/>
+                <w:sz w:val="16"/>
+              </w:rPr>
+              <w:t xml:space="preserve"> en E-</w:t>
+            </w:r>
+            <w:proofErr w:type="spellStart"/>
+            <w:r>
+              <w:rPr>
+                <w:b/>
+                <w:sz w:val="16"/>
+              </w:rPr>
+              <w:t>commerce</w:t>
+            </w:r>
+            <w:proofErr w:type="spellEnd"/>
           </w:p>
         </w:tc>
       </w:tr>
@@ -6566,6 +9366,7 @@
           <w:noProof/>
           <w:sz w:val="20"/>
         </w:rPr>
+        <w:lastRenderedPageBreak/>
         <mc:AlternateContent>
           <mc:Choice Requires="wps">
             <w:drawing>
@@ -6890,7 +9691,21 @@
               <w:rPr>
                 <w:sz w:val="16"/>
               </w:rPr>
-              <w:t>¿Se identificó claramente la problemática del caso práctico?  |  Cumple: X</w:t>
+              <w:t xml:space="preserve">¿Se identificó claramente la problemática del caso práctico?  </w:t>
+            </w:r>
+            <w:proofErr w:type="gramStart"/>
+            <w:r>
+              <w:rPr>
+                <w:sz w:val="16"/>
+              </w:rPr>
+              <w:t>|  Cumple</w:t>
+            </w:r>
+            <w:proofErr w:type="gramEnd"/>
+            <w:r>
+              <w:rPr>
+                <w:sz w:val="16"/>
+              </w:rPr>
+              <w:t>: X</w:t>
             </w:r>
           </w:p>
         </w:tc>
@@ -6908,7 +9723,6 @@
               <w14:uncheckedState w14:val="2610" w14:font="MS Gothic"/>
             </w14:checkbox>
           </w:sdtPr>
-          <w:sdtEndPr/>
           <w:sdtContent>
             <w:tc>
               <w:tcPr>
@@ -6950,7 +9764,6 @@
               <w14:uncheckedState w14:val="2610" w14:font="MS Gothic"/>
             </w14:checkbox>
           </w:sdtPr>
-          <w:sdtEndPr/>
           <w:sdtContent>
             <w:tc>
               <w:tcPr>
@@ -6993,13 +9806,21 @@
               <w:rPr>
                 <w:sz w:val="16"/>
               </w:rPr>
-              <w:t xml:space="preserve">¿Se desarrolló las </w:t>
-            </w:r>
-            <w:r>
-              <w:rPr>
-                <w:sz w:val="16"/>
-              </w:rPr>
-              <w:t>condiciones de los requerimientos solicitados?  |  Cumple: X</w:t>
+              <w:t xml:space="preserve">¿Se desarrolló las condiciones de los requerimientos solicitados?  </w:t>
+            </w:r>
+            <w:proofErr w:type="gramStart"/>
+            <w:r>
+              <w:rPr>
+                <w:sz w:val="16"/>
+              </w:rPr>
+              <w:t>|  Cumple</w:t>
+            </w:r>
+            <w:proofErr w:type="gramEnd"/>
+            <w:r>
+              <w:rPr>
+                <w:sz w:val="16"/>
+              </w:rPr>
+              <w:t>: X</w:t>
             </w:r>
           </w:p>
         </w:tc>
@@ -7017,7 +9838,6 @@
               <w14:uncheckedState w14:val="2610" w14:font="MS Gothic"/>
             </w14:checkbox>
           </w:sdtPr>
-          <w:sdtEndPr/>
           <w:sdtContent>
             <w:tc>
               <w:tcPr>
@@ -7059,7 +9879,6 @@
               <w14:uncheckedState w14:val="2610" w14:font="MS Gothic"/>
             </w14:checkbox>
           </w:sdtPr>
-          <w:sdtEndPr/>
           <w:sdtContent>
             <w:tc>
               <w:tcPr>
@@ -7102,7 +9921,21 @@
               <w:rPr>
                 <w:sz w:val="16"/>
               </w:rPr>
-              <w:t>¿Se formularon respuestas claras y fundamentadas a todas las preguntas guía?  |  Cumple: X</w:t>
+              <w:t xml:space="preserve">¿Se formularon respuestas claras y fundamentadas a todas las preguntas guía?  </w:t>
+            </w:r>
+            <w:proofErr w:type="gramStart"/>
+            <w:r>
+              <w:rPr>
+                <w:sz w:val="16"/>
+              </w:rPr>
+              <w:t>|  Cumple</w:t>
+            </w:r>
+            <w:proofErr w:type="gramEnd"/>
+            <w:r>
+              <w:rPr>
+                <w:sz w:val="16"/>
+              </w:rPr>
+              <w:t>: X</w:t>
             </w:r>
           </w:p>
         </w:tc>
@@ -7120,7 +9953,6 @@
               <w14:uncheckedState w14:val="2610" w14:font="MS Gothic"/>
             </w14:checkbox>
           </w:sdtPr>
-          <w:sdtEndPr/>
           <w:sdtContent>
             <w:tc>
               <w:tcPr>
@@ -7162,7 +9994,6 @@
               <w14:uncheckedState w14:val="2610" w14:font="MS Gothic"/>
             </w14:checkbox>
           </w:sdtPr>
-          <w:sdtEndPr/>
           <w:sdtContent>
             <w:tc>
               <w:tcPr>
@@ -7205,7 +10036,21 @@
               <w:rPr>
                 <w:sz w:val="16"/>
               </w:rPr>
-              <w:t>¿Se elaboró ​​un cronograma claro de actividades a ejecutar?  |  Cumple: X</w:t>
+              <w:t xml:space="preserve">¿Se elaboró ​​un cronograma claro de actividades a ejecutar?  </w:t>
+            </w:r>
+            <w:proofErr w:type="gramStart"/>
+            <w:r>
+              <w:rPr>
+                <w:sz w:val="16"/>
+              </w:rPr>
+              <w:t>|  Cumple</w:t>
+            </w:r>
+            <w:proofErr w:type="gramEnd"/>
+            <w:r>
+              <w:rPr>
+                <w:sz w:val="16"/>
+              </w:rPr>
+              <w:t>: X</w:t>
             </w:r>
           </w:p>
         </w:tc>
@@ -7223,7 +10068,6 @@
               <w14:uncheckedState w14:val="2610" w14:font="MS Gothic"/>
             </w14:checkbox>
           </w:sdtPr>
-          <w:sdtEndPr/>
           <w:sdtContent>
             <w:tc>
               <w:tcPr>
@@ -7265,7 +10109,6 @@
               <w14:uncheckedState w14:val="2610" w14:font="MS Gothic"/>
             </w14:checkbox>
           </w:sdtPr>
-          <w:sdtEndPr/>
           <w:sdtContent>
             <w:tc>
               <w:tcPr>
@@ -7308,7 +10151,21 @@
               <w:rPr>
                 <w:sz w:val="16"/>
               </w:rPr>
-              <w:t>¿Se identificaron y listaron los recursos (máquinas, equipos, herramientas, materiales) necesarios para ejecutar la propuesta?  |  Cumple: X</w:t>
+              <w:t xml:space="preserve">¿Se identificaron y listaron los recursos (máquinas, equipos, herramientas, materiales) necesarios para ejecutar la propuesta?  </w:t>
+            </w:r>
+            <w:proofErr w:type="gramStart"/>
+            <w:r>
+              <w:rPr>
+                <w:sz w:val="16"/>
+              </w:rPr>
+              <w:t>|  Cumple</w:t>
+            </w:r>
+            <w:proofErr w:type="gramEnd"/>
+            <w:r>
+              <w:rPr>
+                <w:sz w:val="16"/>
+              </w:rPr>
+              <w:t>: X</w:t>
             </w:r>
           </w:p>
         </w:tc>
@@ -7326,7 +10183,6 @@
               <w14:uncheckedState w14:val="2610" w14:font="MS Gothic"/>
             </w14:checkbox>
           </w:sdtPr>
-          <w:sdtEndPr/>
           <w:sdtContent>
             <w:tc>
               <w:tcPr>
@@ -7368,7 +10224,6 @@
               <w14:uncheckedState w14:val="2610" w14:font="MS Gothic"/>
             </w14:checkbox>
           </w:sdtPr>
-          <w:sdtEndPr/>
           <w:sdtContent>
             <w:tc>
               <w:tcPr>
@@ -7411,7 +10266,21 @@
               <w:rPr>
                 <w:sz w:val="16"/>
               </w:rPr>
-              <w:t>¿Se ejecutó la propuesta de acuerdo con la planificación y cronograma establecidos?  |  Cumple: X</w:t>
+              <w:t xml:space="preserve">¿Se ejecutó la propuesta de acuerdo con la planificación y cronograma establecidos?  </w:t>
+            </w:r>
+            <w:proofErr w:type="gramStart"/>
+            <w:r>
+              <w:rPr>
+                <w:sz w:val="16"/>
+              </w:rPr>
+              <w:t>|  Cumple</w:t>
+            </w:r>
+            <w:proofErr w:type="gramEnd"/>
+            <w:r>
+              <w:rPr>
+                <w:sz w:val="16"/>
+              </w:rPr>
+              <w:t>: X</w:t>
             </w:r>
           </w:p>
         </w:tc>
@@ -7429,7 +10298,6 @@
               <w14:uncheckedState w14:val="2610" w14:font="MS Gothic"/>
             </w14:checkbox>
           </w:sdtPr>
-          <w:sdtEndPr/>
           <w:sdtContent>
             <w:tc>
               <w:tcPr>
@@ -7471,7 +10339,6 @@
               <w14:uncheckedState w14:val="2610" w14:font="MS Gothic"/>
             </w14:checkbox>
           </w:sdtPr>
-          <w:sdtEndPr/>
           <w:sdtContent>
             <w:tc>
               <w:tcPr>
@@ -7514,7 +10381,21 @@
               <w:rPr>
                 <w:sz w:val="16"/>
               </w:rPr>
-              <w:t>¿Se describieron todas las operaciones y pasos seguidos para garantizar la correcta ejecución?  |  Cumple: X</w:t>
+              <w:t xml:space="preserve">¿Se describieron todas las operaciones y pasos seguidos para garantizar la correcta ejecución?  </w:t>
+            </w:r>
+            <w:proofErr w:type="gramStart"/>
+            <w:r>
+              <w:rPr>
+                <w:sz w:val="16"/>
+              </w:rPr>
+              <w:t>|  Cumple</w:t>
+            </w:r>
+            <w:proofErr w:type="gramEnd"/>
+            <w:r>
+              <w:rPr>
+                <w:sz w:val="16"/>
+              </w:rPr>
+              <w:t>: X</w:t>
             </w:r>
           </w:p>
         </w:tc>
@@ -7532,7 +10413,6 @@
               <w14:uncheckedState w14:val="2610" w14:font="MS Gothic"/>
             </w14:checkbox>
           </w:sdtPr>
-          <w:sdtEndPr/>
           <w:sdtContent>
             <w:tc>
               <w:tcPr>
@@ -7574,7 +10454,6 @@
               <w14:uncheckedState w14:val="2610" w14:font="MS Gothic"/>
             </w14:checkbox>
           </w:sdtPr>
-          <w:sdtEndPr/>
           <w:sdtContent>
             <w:tc>
               <w:tcPr>
@@ -7617,7 +10496,21 @@
               <w:rPr>
                 <w:sz w:val="16"/>
               </w:rPr>
-              <w:t>¿Se consideran las normativas técnicas, de seguridad y medio ambiente en la propuesta de solución?  |  Cumple: X</w:t>
+              <w:t xml:space="preserve">¿Se consideran las normativas técnicas, de seguridad y medio ambiente en la propuesta de solución?  </w:t>
+            </w:r>
+            <w:proofErr w:type="gramStart"/>
+            <w:r>
+              <w:rPr>
+                <w:sz w:val="16"/>
+              </w:rPr>
+              <w:t>|  Cumple</w:t>
+            </w:r>
+            <w:proofErr w:type="gramEnd"/>
+            <w:r>
+              <w:rPr>
+                <w:sz w:val="16"/>
+              </w:rPr>
+              <w:t>: X</w:t>
             </w:r>
           </w:p>
         </w:tc>
@@ -7635,7 +10528,6 @@
               <w14:uncheckedState w14:val="2610" w14:font="MS Gothic"/>
             </w14:checkbox>
           </w:sdtPr>
-          <w:sdtEndPr/>
           <w:sdtContent>
             <w:tc>
               <w:tcPr>
@@ -7677,7 +10569,6 @@
               <w14:uncheckedState w14:val="2610" w14:font="MS Gothic"/>
             </w14:checkbox>
           </w:sdtPr>
-          <w:sdtEndPr/>
           <w:sdtContent>
             <w:tc>
               <w:tcPr>
@@ -7720,7 +10611,21 @@
               <w:rPr>
                 <w:sz w:val="16"/>
               </w:rPr>
-              <w:t>¿La propuesta es pertinente con los requerimientos solicitados?  |  Cumple: X</w:t>
+              <w:t xml:space="preserve">¿La propuesta es pertinente con los requerimientos solicitados?  </w:t>
+            </w:r>
+            <w:proofErr w:type="gramStart"/>
+            <w:r>
+              <w:rPr>
+                <w:sz w:val="16"/>
+              </w:rPr>
+              <w:t>|  Cumple</w:t>
+            </w:r>
+            <w:proofErr w:type="gramEnd"/>
+            <w:r>
+              <w:rPr>
+                <w:sz w:val="16"/>
+              </w:rPr>
+              <w:t>: X</w:t>
             </w:r>
           </w:p>
         </w:tc>
@@ -7738,7 +10643,6 @@
               <w14:uncheckedState w14:val="2610" w14:font="MS Gothic"/>
             </w14:checkbox>
           </w:sdtPr>
-          <w:sdtEndPr/>
           <w:sdtContent>
             <w:tc>
               <w:tcPr>
@@ -7780,7 +10684,6 @@
               <w14:uncheckedState w14:val="2610" w14:font="MS Gothic"/>
             </w14:checkbox>
           </w:sdtPr>
-          <w:sdtEndPr/>
           <w:sdtContent>
             <w:tc>
               <w:tcPr>
@@ -7823,7 +10726,21 @@
               <w:rPr>
                 <w:sz w:val="16"/>
               </w:rPr>
-              <w:t>¿Se evaluó la viabilidad de la propuesta para un contexto real?  |  Cumple: X</w:t>
+              <w:t xml:space="preserve">¿Se evaluó la viabilidad de la propuesta para un contexto real?  </w:t>
+            </w:r>
+            <w:proofErr w:type="gramStart"/>
+            <w:r>
+              <w:rPr>
+                <w:sz w:val="16"/>
+              </w:rPr>
+              <w:t>|  Cumple</w:t>
+            </w:r>
+            <w:proofErr w:type="gramEnd"/>
+            <w:r>
+              <w:rPr>
+                <w:sz w:val="16"/>
+              </w:rPr>
+              <w:t>: X</w:t>
             </w:r>
           </w:p>
         </w:tc>
@@ -7841,7 +10758,6 @@
               <w14:uncheckedState w14:val="2610" w14:font="MS Gothic"/>
             </w14:checkbox>
           </w:sdtPr>
-          <w:sdtEndPr/>
           <w:sdtContent>
             <w:tc>
               <w:tcPr>
@@ -7883,7 +10799,6 @@
               <w14:uncheckedState w14:val="2610" w14:font="MS Gothic"/>
             </w14:checkbox>
           </w:sdtPr>
-          <w:sdtEndPr/>
           <w:sdtContent>
             <w:tc>
               <w:tcPr>
@@ -8036,6 +10951,7 @@
           <w:noProof/>
           <w:sz w:val="20"/>
         </w:rPr>
+        <w:lastRenderedPageBreak/>
         <mc:AlternateContent>
           <mc:Choice Requires="wps">
             <w:drawing>
@@ -8929,6 +11845,7 @@
           <w:sz w:val="20"/>
           <w:lang w:val="es-PE" w:eastAsia="es-PE"/>
         </w:rPr>
+        <w:lastRenderedPageBreak/>
         <w:drawing>
           <wp:anchor distT="0" distB="0" distL="114300" distR="114300" simplePos="0" relativeHeight="251710464" behindDoc="0" locked="0" layoutInCell="1" allowOverlap="1" wp14:anchorId="67639738" wp14:editId="0D3DE437">
             <wp:simplePos x="0" y="0"/>
@@ -9034,7 +11951,6 @@
         <w:docPartUnique/>
       </w:docPartObj>
     </w:sdtPr>
-    <w:sdtEndPr/>
     <w:sdtContent>
       <w:p>
         <w:pPr>
@@ -9475,7 +12391,6 @@
         <w:docPartUnique/>
       </w:docPartObj>
     </w:sdtPr>
-    <w:sdtEndPr/>
     <w:sdtContent>
       <w:p>
         <w:pPr>
@@ -18748,15 +21663,6 @@
 </file>
 
 <file path=customXml/item1.xml><?xml version="1.0" encoding="utf-8"?>
-<?mso-contentType ?>
-<FormTemplates xmlns="http://schemas.microsoft.com/sharepoint/v3/contenttype/forms">
-  <Display>DocumentLibraryForm</Display>
-  <Edit>DocumentLibraryForm</Edit>
-  <New>DocumentLibraryForm</New>
-</FormTemplates>
-</file>
-
-<file path=customXml/item2.xml><?xml version="1.0" encoding="utf-8"?>
 <ct:contentTypeSchema xmlns:ct="http://schemas.microsoft.com/office/2006/metadata/contentType" xmlns:ma="http://schemas.microsoft.com/office/2006/metadata/properties/metaAttributes" ct:_="" ma:_="" ma:contentTypeName="Document" ma:contentTypeID="0x010100795EFC9A07ECD140851F1B2ABF131888" ma:contentTypeVersion="42" ma:contentTypeDescription="Create a new document." ma:contentTypeScope="" ma:versionID="68705ce6714181f4c3a7778789206999">
   <xsd:schema xmlns:xsd="http://www.w3.org/2001/XMLSchema" xmlns:xs="http://www.w3.org/2001/XMLSchema" xmlns:p="http://schemas.microsoft.com/office/2006/metadata/properties" xmlns:ns2="8b0498ea-4bc6-4676-a87b-9cffe7f59fc7" xmlns:ns3="ee27a0f9-7ff9-4c05-b61a-f7053cc3ff56" targetNamespace="http://schemas.microsoft.com/office/2006/metadata/properties" ma:root="true" ma:fieldsID="837849ccf018e896f9c9e07cfaff02ef" ns2:_="" ns3:_="">
     <xsd:import namespace="8b0498ea-4bc6-4676-a87b-9cffe7f59fc7"/>
@@ -19052,7 +21958,20 @@
 </ct:contentTypeSchema>
 </file>
 
+<file path=customXml/item2.xml><?xml version="1.0" encoding="utf-8"?>
+<?mso-contentType ?>
+<FormTemplates xmlns="http://schemas.microsoft.com/sharepoint/v3/contenttype/forms">
+  <Display>DocumentLibraryForm</Display>
+  <Edit>DocumentLibraryForm</Edit>
+  <New>DocumentLibraryForm</New>
+</FormTemplates>
+</file>
+
 <file path=customXml/item3.xml><?xml version="1.0" encoding="utf-8"?>
+<b:Sources xmlns:b="http://schemas.openxmlformats.org/officeDocument/2006/bibliography" xmlns="http://schemas.openxmlformats.org/officeDocument/2006/bibliography" SelectedStyle="\APA.XSL" StyleName="APA"/>
+</file>
+
+<file path=customXml/item4.xml><?xml version="1.0" encoding="utf-8"?>
 <p:properties xmlns:p="http://schemas.microsoft.com/office/2006/metadata/properties" xmlns:xsi="http://www.w3.org/2001/XMLSchema-instance" xmlns:pc="http://schemas.microsoft.com/office/infopath/2007/PartnerControls">
   <documentManagement>
     <TaxCatchAll xmlns="ee27a0f9-7ff9-4c05-b61a-f7053cc3ff56" xsi:nil="true"/>
@@ -19075,19 +21994,7 @@
 </p:properties>
 </file>
 
-<file path=customXml/item4.xml><?xml version="1.0" encoding="utf-8"?>
-<b:Sources xmlns:b="http://schemas.openxmlformats.org/officeDocument/2006/bibliography" xmlns="http://schemas.openxmlformats.org/officeDocument/2006/bibliography" SelectedStyle="\APA.XSL" StyleName="APA"/>
-</file>
-
 <file path=customXml/itemProps1.xml><?xml version="1.0" encoding="utf-8"?>
-<ds:datastoreItem xmlns:ds="http://schemas.openxmlformats.org/officeDocument/2006/customXml" ds:itemID="{04A08A2F-85C4-4058-B79A-F3E79FBC01F5}">
-  <ds:schemaRefs>
-    <ds:schemaRef ds:uri="http://schemas.microsoft.com/sharepoint/v3/contenttype/forms"/>
-  </ds:schemaRefs>
-</ds:datastoreItem>
-</file>
-
-<file path=customXml/itemProps2.xml><?xml version="1.0" encoding="utf-8"?>
 <ds:datastoreItem xmlns:ds="http://schemas.openxmlformats.org/officeDocument/2006/customXml" ds:itemID="{A88248DD-87C0-4F3B-9F04-304093540A37}">
   <ds:schemaRefs>
     <ds:schemaRef ds:uri="http://schemas.microsoft.com/office/2006/metadata/contentType"/>
@@ -19106,21 +22013,29 @@
 </ds:datastoreItem>
 </file>
 
+<file path=customXml/itemProps2.xml><?xml version="1.0" encoding="utf-8"?>
+<ds:datastoreItem xmlns:ds="http://schemas.openxmlformats.org/officeDocument/2006/customXml" ds:itemID="{04A08A2F-85C4-4058-B79A-F3E79FBC01F5}">
+  <ds:schemaRefs>
+    <ds:schemaRef ds:uri="http://schemas.microsoft.com/sharepoint/v3/contenttype/forms"/>
+  </ds:schemaRefs>
+</ds:datastoreItem>
+</file>
+
 <file path=customXml/itemProps3.xml><?xml version="1.0" encoding="utf-8"?>
-<ds:datastoreItem xmlns:ds="http://schemas.openxmlformats.org/officeDocument/2006/customXml" ds:itemID="{BF77E685-4CE1-49EA-B15D-526260D8588E}">
+<ds:datastoreItem xmlns:ds="http://schemas.openxmlformats.org/officeDocument/2006/customXml" ds:itemID="{239388DF-88FD-438D-B1BD-96BBE38697C0}">
   <ds:schemaRefs>
-    <ds:schemaRef ds:uri="http://schemas.microsoft.com/office/2006/metadata/properties"/>
-    <ds:schemaRef ds:uri="http://schemas.microsoft.com/office/infopath/2007/PartnerControls"/>
-    <ds:schemaRef ds:uri="8b0498ea-4bc6-4676-a87b-9cffe7f59fc7"/>
-    <ds:schemaRef ds:uri="ee27a0f9-7ff9-4c05-b61a-f7053cc3ff56"/>
+    <ds:schemaRef ds:uri="http://schemas.openxmlformats.org/officeDocument/2006/bibliography"/>
   </ds:schemaRefs>
 </ds:datastoreItem>
 </file>
 
 <file path=customXml/itemProps4.xml><?xml version="1.0" encoding="utf-8"?>
-<ds:datastoreItem xmlns:ds="http://schemas.openxmlformats.org/officeDocument/2006/customXml" ds:itemID="{239388DF-88FD-438D-B1BD-96BBE38697C0}">
+<ds:datastoreItem xmlns:ds="http://schemas.openxmlformats.org/officeDocument/2006/customXml" ds:itemID="{BF77E685-4CE1-49EA-B15D-526260D8588E}">
   <ds:schemaRefs>
-    <ds:schemaRef ds:uri="http://schemas.openxmlformats.org/officeDocument/2006/bibliography"/>
+    <ds:schemaRef ds:uri="http://schemas.microsoft.com/office/2006/metadata/properties"/>
+    <ds:schemaRef ds:uri="http://schemas.microsoft.com/office/infopath/2007/PartnerControls"/>
+    <ds:schemaRef ds:uri="ee27a0f9-7ff9-4c05-b61a-f7053cc3ff56"/>
+    <ds:schemaRef ds:uri="8b0498ea-4bc6-4676-a87b-9cffe7f59fc7"/>
   </ds:schemaRefs>
 </ds:datastoreItem>
 </file>
</xml_diff>